<commit_message>
cleaned up outline.md and copied info into Task 1 Guide.docx
</commit_message>
<xml_diff>
--- a/d246/Task 1 Guide.docx
+++ b/d246/Task 1 Guide.docx
@@ -1,13 +1,13 @@
 
 <file path=word/document.xml><?xml version="1.0" encoding="utf-8"?>
-<w:document xmlns:wpc="http://schemas.microsoft.com/office/word/2010/wordprocessingCanvas" xmlns:cx="http://schemas.microsoft.com/office/drawing/2014/chartex" xmlns:cx1="http://schemas.microsoft.com/office/drawing/2015/9/8/chartex" xmlns:cx2="http://schemas.microsoft.com/office/drawing/2015/10/21/chartex" xmlns:cx3="http://schemas.microsoft.com/office/drawing/2016/5/9/chartex" xmlns:cx4="http://schemas.microsoft.com/office/drawing/2016/5/10/chartex" xmlns:cx5="http://schemas.microsoft.com/office/drawing/2016/5/11/chartex" xmlns:cx6="http://schemas.microsoft.com/office/drawing/2016/5/12/chartex" xmlns:cx7="http://schemas.microsoft.com/office/drawing/2016/5/13/chartex" xmlns:cx8="http://schemas.microsoft.com/office/drawing/2016/5/14/chartex" xmlns:mc="http://schemas.openxmlformats.org/markup-compatibility/2006" xmlns:aink="http://schemas.microsoft.com/office/drawing/2016/ink" xmlns:am3d="http://schemas.microsoft.com/office/drawing/2017/model3d" xmlns:o="urn:schemas-microsoft-com:office:office" xmlns:oel="http://schemas.microsoft.com/office/2019/extlst" xmlns:r="http://schemas.openxmlformats.org/officeDocument/2006/relationships" xmlns:m="http://schemas.openxmlformats.org/officeDocument/2006/math" xmlns:v="urn:schemas-microsoft-com:vml" xmlns:wp14="http://schemas.microsoft.com/office/word/2010/wordprocessingDrawing" xmlns:wp="http://schemas.openxmlformats.org/drawingml/2006/wordprocessingDrawing" xmlns:w10="urn:schemas-microsoft-com:office:word" xmlns:w="http://schemas.openxmlformats.org/wordprocessingml/2006/main" xmlns:w14="http://schemas.microsoft.com/office/word/2010/wordml" xmlns:w15="http://schemas.microsoft.com/office/word/2012/wordml" xmlns:w16cex="http://schemas.microsoft.com/office/word/2018/wordml/cex" xmlns:w16cid="http://schemas.microsoft.com/office/word/2016/wordml/cid" xmlns:w16="http://schemas.microsoft.com/office/word/2018/wordml" xmlns:w16du="http://schemas.microsoft.com/office/word/2023/wordml/word16du" xmlns:w16sdtdh="http://schemas.microsoft.com/office/word/2020/wordml/sdtdatahash" xmlns:w16sdtfl="http://schemas.microsoft.com/office/word/2024/wordml/sdtformatlock" xmlns:w16se="http://schemas.microsoft.com/office/word/2015/wordml/symex" xmlns:wpg="http://schemas.microsoft.com/office/word/2010/wordprocessingGroup" xmlns:wpi="http://schemas.microsoft.com/office/word/2010/wordprocessingInk" xmlns:wne="http://schemas.microsoft.com/office/word/2006/wordml" xmlns:wps="http://schemas.microsoft.com/office/word/2010/wordprocessingShape" mc:Ignorable="w14 w15 w16se w16cid w16 w16cex w16sdtdh w16sdtfl w16du wp14">
+<w:document xmlns:wpc="http://schemas.microsoft.com/office/word/2010/wordprocessingCanvas" xmlns:cx="http://schemas.microsoft.com/office/drawing/2014/chartex" xmlns:cx1="http://schemas.microsoft.com/office/drawing/2015/9/8/chartex" xmlns:cx2="http://schemas.microsoft.com/office/drawing/2015/10/21/chartex" xmlns:cx3="http://schemas.microsoft.com/office/drawing/2016/5/9/chartex" xmlns:cx4="http://schemas.microsoft.com/office/drawing/2016/5/10/chartex" xmlns:cx5="http://schemas.microsoft.com/office/drawing/2016/5/11/chartex" xmlns:cx6="http://schemas.microsoft.com/office/drawing/2016/5/12/chartex" xmlns:cx7="http://schemas.microsoft.com/office/drawing/2016/5/13/chartex" xmlns:cx8="http://schemas.microsoft.com/office/drawing/2016/5/14/chartex" xmlns:mc="http://schemas.openxmlformats.org/markup-compatibility/2006" xmlns:m="http://schemas.openxmlformats.org/officeDocument/2006/math" xmlns:aink="http://schemas.microsoft.com/office/drawing/2016/ink" xmlns:am3d="http://schemas.microsoft.com/office/drawing/2017/model3d" xmlns:oel="http://schemas.microsoft.com/office/2019/extlst" xmlns:r="http://schemas.openxmlformats.org/officeDocument/2006/relationships" xmlns:wp14="http://schemas.microsoft.com/office/word/2010/wordprocessingDrawing" xmlns:wp="http://schemas.openxmlformats.org/drawingml/2006/wordprocessingDrawing" xmlns:wpg="http://schemas.microsoft.com/office/word/2010/wordprocessingGroup" xmlns:wpi="http://schemas.microsoft.com/office/word/2010/wordprocessingInk" xmlns:wps="http://schemas.microsoft.com/office/word/2010/wordprocessingShape" xmlns:o="urn:schemas-microsoft-com:office:office" xmlns:v="urn:schemas-microsoft-com:vml" xmlns:w10="urn:schemas-microsoft-com:office:word" xmlns:w="http://schemas.openxmlformats.org/wordprocessingml/2006/main" xmlns:w14="http://schemas.microsoft.com/office/word/2010/wordml" xmlns:w15="http://schemas.microsoft.com/office/word/2012/wordml" xmlns:w16cex="http://schemas.microsoft.com/office/word/2018/wordml/cex" xmlns:w16cid="http://schemas.microsoft.com/office/word/2016/wordml/cid" xmlns:w16="http://schemas.microsoft.com/office/word/2018/wordml" xmlns:w16sdtdh="http://schemas.microsoft.com/office/word/2020/wordml/sdtdatahash" xmlns:w16sdtfl="http://schemas.microsoft.com/office/word/2024/wordml/sdtformatlock" xmlns:w16se="http://schemas.microsoft.com/office/word/2015/wordml/symex" xmlns:w16du="http://schemas.microsoft.com/office/word/2023/wordml/word16du" xmlns:wne="http://schemas.microsoft.com/office/word/2006/wordml" mc:Ignorable="w14 w15 w16se w16cid w16 w16cex w16sdtdh w16sdtfl w16du wp14">
   <w:body>
     <w:p>
       <w:pPr>
         <w:spacing w:after="0" w:line="240" w:lineRule="auto"/>
         <w:jc w:val="center"/>
         <w:rPr>
-          <w:rFonts w:ascii="Arial" w:hAnsi="Arial" w:eastAsia="Arial" w:cs="Arial"/>
+          <w:rFonts w:ascii="Arial" w:eastAsia="Arial" w:hAnsi="Arial" w:cs="Arial"/>
           <w:color w:val="000000" w:themeColor="text1"/>
           <w:sz w:val="28"/>
           <w:szCs w:val="28"/>
@@ -16,7 +16,7 @@
       <w:r>
         <w:rPr>
           <w:rStyle w:val="normaltextrun"/>
-          <w:rFonts w:ascii="Arial" w:hAnsi="Arial" w:eastAsia="Arial" w:cs="Arial"/>
+          <w:rFonts w:ascii="Arial" w:eastAsia="Arial" w:hAnsi="Arial" w:cs="Arial"/>
           <w:b/>
           <w:bCs/>
           <w:color w:val="000000" w:themeColor="text1"/>
@@ -29,7 +29,7 @@
       <w:r>
         <w:rPr>
           <w:rStyle w:val="normaltextrun"/>
-          <w:rFonts w:ascii="Arial" w:hAnsi="Arial" w:eastAsia="Arial" w:cs="Arial"/>
+          <w:rFonts w:ascii="Arial" w:eastAsia="Arial" w:hAnsi="Arial" w:cs="Arial"/>
           <w:b/>
           <w:bCs/>
           <w:color w:val="000000" w:themeColor="text1"/>
@@ -42,7 +42,7 @@
       <w:r>
         <w:rPr>
           <w:rStyle w:val="normaltextrun"/>
-          <w:rFonts w:ascii="Arial" w:hAnsi="Arial" w:eastAsia="Arial" w:cs="Arial"/>
+          <w:rFonts w:ascii="Arial" w:eastAsia="Arial" w:hAnsi="Arial" w:cs="Arial"/>
           <w:b/>
           <w:bCs/>
           <w:color w:val="000000" w:themeColor="text1"/>
@@ -55,7 +55,7 @@
       <w:r>
         <w:rPr>
           <w:rStyle w:val="normaltextrun"/>
-          <w:rFonts w:ascii="Arial" w:hAnsi="Arial" w:eastAsia="Arial" w:cs="Arial"/>
+          <w:rFonts w:ascii="Arial" w:eastAsia="Arial" w:hAnsi="Arial" w:cs="Arial"/>
           <w:b/>
           <w:bCs/>
           <w:color w:val="000000" w:themeColor="text1"/>
@@ -68,7 +68,7 @@
       <w:r>
         <w:rPr>
           <w:rStyle w:val="normaltextrun"/>
-          <w:rFonts w:ascii="Arial" w:hAnsi="Arial" w:eastAsia="Arial" w:cs="Arial"/>
+          <w:rFonts w:ascii="Arial" w:eastAsia="Arial" w:hAnsi="Arial" w:cs="Arial"/>
           <w:b/>
           <w:bCs/>
           <w:color w:val="000000" w:themeColor="text1"/>
@@ -81,7 +81,7 @@
       <w:r>
         <w:rPr>
           <w:rStyle w:val="normaltextrun"/>
-          <w:rFonts w:ascii="Arial" w:hAnsi="Arial" w:eastAsia="Arial" w:cs="Arial"/>
+          <w:rFonts w:ascii="Arial" w:eastAsia="Arial" w:hAnsi="Arial" w:cs="Arial"/>
           <w:b/>
           <w:bCs/>
           <w:color w:val="000000" w:themeColor="text1"/>
@@ -94,7 +94,7 @@
       <w:r>
         <w:rPr>
           <w:rStyle w:val="eop"/>
-          <w:rFonts w:ascii="Arial" w:hAnsi="Arial" w:eastAsia="Arial" w:cs="Arial"/>
+          <w:rFonts w:ascii="Arial" w:eastAsia="Arial" w:hAnsi="Arial" w:cs="Arial"/>
           <w:color w:val="000000" w:themeColor="text1"/>
           <w:sz w:val="28"/>
           <w:szCs w:val="28"/>
@@ -107,7 +107,7 @@
         <w:spacing w:after="0" w:line="240" w:lineRule="auto"/>
         <w:jc w:val="center"/>
         <w:rPr>
-          <w:rFonts w:ascii="Arial" w:hAnsi="Arial" w:eastAsia="Arial" w:cs="Arial"/>
+          <w:rFonts w:ascii="Arial" w:eastAsia="Arial" w:hAnsi="Arial" w:cs="Arial"/>
           <w:color w:val="000000" w:themeColor="text1"/>
           <w:sz w:val="28"/>
           <w:szCs w:val="28"/>
@@ -116,7 +116,7 @@
       <w:r>
         <w:rPr>
           <w:rStyle w:val="eop"/>
-          <w:rFonts w:ascii="Arial" w:hAnsi="Arial" w:eastAsia="Arial" w:cs="Arial"/>
+          <w:rFonts w:ascii="Arial" w:eastAsia="Arial" w:hAnsi="Arial" w:cs="Arial"/>
           <w:color w:val="000000" w:themeColor="text1"/>
           <w:sz w:val="28"/>
           <w:szCs w:val="28"/>
@@ -129,7 +129,7 @@
         <w:spacing w:after="0" w:line="240" w:lineRule="auto"/>
         <w:rPr>
           <w:rStyle w:val="eop"/>
-          <w:rFonts w:ascii="Arial" w:hAnsi="Arial" w:eastAsia="Arial" w:cs="Arial"/>
+          <w:rFonts w:ascii="Arial" w:eastAsia="Arial" w:hAnsi="Arial" w:cs="Arial"/>
           <w:color w:val="000000" w:themeColor="text1"/>
           <w:sz w:val="28"/>
           <w:szCs w:val="28"/>
@@ -138,7 +138,7 @@
       <w:r>
         <w:rPr>
           <w:rStyle w:val="normaltextrun"/>
-          <w:rFonts w:ascii="Arial" w:hAnsi="Arial" w:eastAsia="Arial" w:cs="Arial"/>
+          <w:rFonts w:ascii="Arial" w:eastAsia="Arial" w:hAnsi="Arial" w:cs="Arial"/>
           <w:color w:val="000000" w:themeColor="text1"/>
           <w:sz w:val="28"/>
           <w:szCs w:val="28"/>
@@ -150,7 +150,7 @@
       <w:r>
         <w:rPr>
           <w:rStyle w:val="normaltextrun"/>
-          <w:rFonts w:ascii="Arial" w:hAnsi="Arial" w:eastAsia="Arial" w:cs="Arial"/>
+          <w:rFonts w:ascii="Arial" w:eastAsia="Arial" w:hAnsi="Arial" w:cs="Arial"/>
           <w:color w:val="000000" w:themeColor="text1"/>
           <w:sz w:val="28"/>
           <w:szCs w:val="28"/>
@@ -161,7 +161,7 @@
       <w:r>
         <w:rPr>
           <w:rStyle w:val="normaltextrun"/>
-          <w:rFonts w:ascii="Arial" w:hAnsi="Arial" w:eastAsia="Arial" w:cs="Arial"/>
+          <w:rFonts w:ascii="Arial" w:eastAsia="Arial" w:hAnsi="Arial" w:cs="Arial"/>
           <w:color w:val="000000" w:themeColor="text1"/>
           <w:sz w:val="28"/>
           <w:szCs w:val="28"/>
@@ -172,7 +172,7 @@
       <w:r>
         <w:rPr>
           <w:rStyle w:val="normaltextrun"/>
-          <w:rFonts w:ascii="Arial" w:hAnsi="Arial" w:eastAsia="Arial" w:cs="Arial"/>
+          <w:rFonts w:ascii="Arial" w:eastAsia="Arial" w:hAnsi="Arial" w:cs="Arial"/>
           <w:color w:val="000000" w:themeColor="text1"/>
           <w:sz w:val="28"/>
           <w:szCs w:val="28"/>
@@ -183,7 +183,7 @@
       <w:r>
         <w:rPr>
           <w:rStyle w:val="normaltextrun"/>
-          <w:rFonts w:ascii="Arial" w:hAnsi="Arial" w:eastAsia="Arial" w:cs="Arial"/>
+          <w:rFonts w:ascii="Arial" w:eastAsia="Arial" w:hAnsi="Arial" w:cs="Arial"/>
           <w:color w:val="000000" w:themeColor="text1"/>
           <w:sz w:val="28"/>
           <w:szCs w:val="28"/>
@@ -194,7 +194,7 @@
       <w:r>
         <w:rPr>
           <w:rStyle w:val="normaltextrun"/>
-          <w:rFonts w:ascii="Arial" w:hAnsi="Arial" w:eastAsia="Arial" w:cs="Arial"/>
+          <w:rFonts w:ascii="Arial" w:eastAsia="Arial" w:hAnsi="Arial" w:cs="Arial"/>
           <w:color w:val="000000" w:themeColor="text1"/>
           <w:sz w:val="28"/>
           <w:szCs w:val="28"/>
@@ -205,7 +205,7 @@
       <w:r>
         <w:rPr>
           <w:rStyle w:val="normaltextrun"/>
-          <w:rFonts w:ascii="Arial" w:hAnsi="Arial" w:eastAsia="Arial" w:cs="Arial"/>
+          <w:rFonts w:ascii="Arial" w:eastAsia="Arial" w:hAnsi="Arial" w:cs="Arial"/>
           <w:color w:val="000000" w:themeColor="text1"/>
           <w:sz w:val="28"/>
           <w:szCs w:val="28"/>
@@ -234,14 +234,13 @@
             <w:tcW w:w="9360" w:type="dxa"/>
             <w:gridSpan w:val="2"/>
             <w:shd w:val="clear" w:color="auto" w:fill="FFF2CC" w:themeFill="accent4" w:themeFillTint="33"/>
-            <w:tcMar/>
           </w:tcPr>
           <w:p>
             <w:pPr>
               <w:spacing w:line="259" w:lineRule="auto"/>
               <w:jc w:val="center"/>
               <w:rPr>
-                <w:rFonts w:ascii="Arial" w:hAnsi="Arial" w:eastAsia="Arial" w:cs="Arial"/>
+                <w:rFonts w:ascii="Arial" w:eastAsia="Arial" w:hAnsi="Arial" w:cs="Arial"/>
                 <w:b/>
                 <w:bCs/>
                 <w:sz w:val="28"/>
@@ -250,7 +249,7 @@
             </w:pPr>
             <w:r>
               <w:rPr>
-                <w:rFonts w:ascii="Arial" w:hAnsi="Arial" w:eastAsia="Arial" w:cs="Arial"/>
+                <w:rFonts w:ascii="Arial" w:eastAsia="Arial" w:hAnsi="Arial" w:cs="Arial"/>
                 <w:b/>
                 <w:bCs/>
                 <w:sz w:val="28"/>
@@ -260,7 +259,7 @@
             </w:r>
             <w:r>
               <w:rPr>
-                <w:rFonts w:ascii="Arial" w:hAnsi="Arial" w:eastAsia="Arial" w:cs="Arial"/>
+                <w:rFonts w:ascii="Arial" w:eastAsia="Arial" w:hAnsi="Arial" w:cs="Arial"/>
                 <w:b/>
                 <w:bCs/>
                 <w:sz w:val="28"/>
@@ -293,7 +292,7 @@
               <w:spacing w:line="259" w:lineRule="auto"/>
               <w:jc w:val="center"/>
               <w:rPr>
-                <w:rFonts w:ascii="Arial" w:hAnsi="Arial" w:eastAsia="Arial" w:cs="Arial"/>
+                <w:rFonts w:ascii="Arial" w:eastAsia="Arial" w:hAnsi="Arial" w:cs="Arial"/>
                 <w:color w:val="000000" w:themeColor="text1"/>
                 <w:sz w:val="28"/>
                 <w:szCs w:val="28"/>
@@ -309,12 +308,11 @@
         <w:tc>
           <w:tcPr>
             <w:tcW w:w="4680" w:type="dxa"/>
-            <w:tcMar/>
           </w:tcPr>
           <w:p>
             <w:pPr>
               <w:rPr>
-                <w:rFonts w:ascii="Arial" w:hAnsi="Arial" w:eastAsia="Arial" w:cs="Arial"/>
+                <w:rFonts w:ascii="Arial" w:eastAsia="Arial" w:hAnsi="Arial" w:cs="Arial"/>
                 <w:color w:val="000000" w:themeColor="text1"/>
                 <w:sz w:val="28"/>
                 <w:szCs w:val="28"/>
@@ -322,7 +320,7 @@
             </w:pPr>
             <w:r>
               <w:rPr>
-                <w:rFonts w:ascii="Arial" w:hAnsi="Arial" w:eastAsia="Arial" w:cs="Arial"/>
+                <w:rFonts w:ascii="Arial" w:eastAsia="Arial" w:hAnsi="Arial" w:cs="Arial"/>
                 <w:b/>
                 <w:bCs/>
                 <w:color w:val="000000" w:themeColor="text1"/>
@@ -333,7 +331,7 @@
             </w:r>
             <w:r>
               <w:rPr>
-                <w:rFonts w:ascii="Arial" w:hAnsi="Arial" w:eastAsia="Arial" w:cs="Arial"/>
+                <w:rFonts w:ascii="Arial" w:eastAsia="Arial" w:hAnsi="Arial" w:cs="Arial"/>
                 <w:b/>
                 <w:bCs/>
                 <w:color w:val="000000" w:themeColor="text1"/>
@@ -344,7 +342,7 @@
             </w:r>
             <w:r>
               <w:rPr>
-                <w:rFonts w:ascii="Arial" w:hAnsi="Arial" w:eastAsia="Arial" w:cs="Arial"/>
+                <w:rFonts w:ascii="Arial" w:eastAsia="Arial" w:hAnsi="Arial" w:cs="Arial"/>
                 <w:color w:val="000000" w:themeColor="text1"/>
                 <w:sz w:val="28"/>
                 <w:szCs w:val="28"/>
@@ -353,7 +351,7 @@
             </w:r>
             <w:r>
               <w:rPr>
-                <w:rFonts w:ascii="Arial" w:hAnsi="Arial" w:eastAsia="Arial" w:cs="Arial"/>
+                <w:rFonts w:ascii="Arial" w:eastAsia="Arial" w:hAnsi="Arial" w:cs="Arial"/>
                 <w:color w:val="000000" w:themeColor="text1"/>
                 <w:sz w:val="28"/>
                 <w:szCs w:val="28"/>
@@ -362,7 +360,7 @@
             </w:r>
             <w:r>
               <w:rPr>
-                <w:rFonts w:ascii="Arial" w:hAnsi="Arial" w:eastAsia="Arial" w:cs="Arial"/>
+                <w:rFonts w:ascii="Arial" w:eastAsia="Arial" w:hAnsi="Arial" w:cs="Arial"/>
                 <w:color w:val="000000" w:themeColor="text1"/>
                 <w:sz w:val="28"/>
                 <w:szCs w:val="28"/>
@@ -371,7 +369,7 @@
             </w:r>
             <w:r>
               <w:rPr>
-                <w:rFonts w:ascii="Arial" w:hAnsi="Arial" w:eastAsia="Arial" w:cs="Arial"/>
+                <w:rFonts w:ascii="Arial" w:eastAsia="Arial" w:hAnsi="Arial" w:cs="Arial"/>
                 <w:color w:val="000000" w:themeColor="text1"/>
                 <w:sz w:val="28"/>
                 <w:szCs w:val="28"/>
@@ -380,7 +378,7 @@
             </w:r>
             <w:r>
               <w:rPr>
-                <w:rFonts w:ascii="Arial" w:hAnsi="Arial" w:eastAsia="Arial" w:cs="Arial"/>
+                <w:rFonts w:ascii="Arial" w:eastAsia="Arial" w:hAnsi="Arial" w:cs="Arial"/>
                 <w:color w:val="000000" w:themeColor="text1"/>
                 <w:sz w:val="28"/>
                 <w:szCs w:val="28"/>
@@ -389,7 +387,7 @@
             </w:r>
             <w:r>
               <w:rPr>
-                <w:rFonts w:ascii="Arial" w:hAnsi="Arial" w:eastAsia="Arial" w:cs="Arial"/>
+                <w:rFonts w:ascii="Arial" w:eastAsia="Arial" w:hAnsi="Arial" w:cs="Arial"/>
                 <w:color w:val="000000" w:themeColor="text1"/>
                 <w:sz w:val="28"/>
                 <w:szCs w:val="28"/>
@@ -398,7 +396,7 @@
             </w:r>
             <w:r>
               <w:rPr>
-                <w:rFonts w:ascii="Arial" w:hAnsi="Arial" w:eastAsia="Arial" w:cs="Arial"/>
+                <w:rFonts w:ascii="Arial" w:eastAsia="Arial" w:hAnsi="Arial" w:cs="Arial"/>
                 <w:color w:val="000000" w:themeColor="text1"/>
                 <w:sz w:val="28"/>
                 <w:szCs w:val="28"/>
@@ -407,7 +405,7 @@
             </w:r>
             <w:r>
               <w:rPr>
-                <w:rFonts w:ascii="Arial" w:hAnsi="Arial" w:eastAsia="Arial" w:cs="Arial"/>
+                <w:rFonts w:ascii="Arial" w:eastAsia="Arial" w:hAnsi="Arial" w:cs="Arial"/>
                 <w:color w:val="000000" w:themeColor="text1"/>
                 <w:sz w:val="28"/>
                 <w:szCs w:val="28"/>
@@ -416,7 +414,7 @@
             </w:r>
             <w:r>
               <w:rPr>
-                <w:rFonts w:ascii="Arial" w:hAnsi="Arial" w:eastAsia="Arial" w:cs="Arial"/>
+                <w:rFonts w:ascii="Arial" w:eastAsia="Arial" w:hAnsi="Arial" w:cs="Arial"/>
                 <w:b/>
                 <w:bCs/>
                 <w:color w:val="000000" w:themeColor="text1"/>
@@ -427,7 +425,7 @@
             </w:r>
             <w:r>
               <w:rPr>
-                <w:rFonts w:ascii="Arial" w:hAnsi="Arial" w:eastAsia="Arial" w:cs="Arial"/>
+                <w:rFonts w:ascii="Arial" w:eastAsia="Arial" w:hAnsi="Arial" w:cs="Arial"/>
                 <w:b/>
                 <w:bCs/>
                 <w:color w:val="000000" w:themeColor="text1"/>
@@ -438,7 +436,7 @@
             </w:r>
             <w:r>
               <w:rPr>
-                <w:rFonts w:ascii="Arial" w:hAnsi="Arial" w:eastAsia="Arial" w:cs="Arial"/>
+                <w:rFonts w:ascii="Arial" w:eastAsia="Arial" w:hAnsi="Arial" w:cs="Arial"/>
                 <w:b/>
                 <w:bCs/>
                 <w:color w:val="000000" w:themeColor="text1"/>
@@ -449,7 +447,7 @@
             </w:r>
             <w:r>
               <w:rPr>
-                <w:rFonts w:ascii="Arial" w:hAnsi="Arial" w:eastAsia="Arial" w:cs="Arial"/>
+                <w:rFonts w:ascii="Arial" w:eastAsia="Arial" w:hAnsi="Arial" w:cs="Arial"/>
                 <w:b/>
                 <w:bCs/>
                 <w:color w:val="000000" w:themeColor="text1"/>
@@ -460,7 +458,7 @@
             </w:r>
             <w:r>
               <w:rPr>
-                <w:rFonts w:ascii="Arial" w:hAnsi="Arial" w:eastAsia="Arial" w:cs="Arial"/>
+                <w:rFonts w:ascii="Arial" w:eastAsia="Arial" w:hAnsi="Arial" w:cs="Arial"/>
                 <w:b/>
                 <w:bCs/>
                 <w:color w:val="000000" w:themeColor="text1"/>
@@ -474,55 +472,88 @@
         <w:tc>
           <w:tcPr>
             <w:tcW w:w="4680" w:type="dxa"/>
-            <w:tcMar/>
           </w:tcPr>
           <w:p>
             <w:pPr>
               <w:rPr>
-                <w:rFonts w:ascii="Arial" w:hAnsi="Arial" w:eastAsia="Arial" w:cs="Arial"/>
+                <w:rFonts w:ascii="Arial" w:eastAsia="Arial" w:hAnsi="Arial" w:cs="Arial"/>
                 <w:sz w:val="28"/>
                 <w:szCs w:val="28"/>
               </w:rPr>
             </w:pPr>
             <w:r>
               <w:rPr>
-                <w:rFonts w:ascii="Arial" w:hAnsi="Arial" w:eastAsia="Arial" w:cs="Arial"/>
-                <w:sz w:val="28"/>
-                <w:szCs w:val="28"/>
-              </w:rPr>
-              <w:t>Provide some details</w:t>
-            </w:r>
-            <w:r>
-              <w:rPr>
-                <w:rFonts w:ascii="Arial" w:hAnsi="Arial" w:eastAsia="Arial" w:cs="Arial"/>
-                <w:sz w:val="28"/>
-                <w:szCs w:val="28"/>
-              </w:rPr>
-              <w:t xml:space="preserve"> here</w:t>
-            </w:r>
-            <w:r>
-              <w:rPr>
-                <w:rFonts w:ascii="Arial" w:hAnsi="Arial" w:eastAsia="Arial" w:cs="Arial"/>
-                <w:sz w:val="28"/>
-                <w:szCs w:val="28"/>
-              </w:rPr>
-              <w:t xml:space="preserve"> about your </w:t>
-            </w:r>
-            <w:r>
-              <w:rPr>
-                <w:rFonts w:ascii="Arial" w:hAnsi="Arial" w:eastAsia="Arial" w:cs="Arial"/>
-                <w:sz w:val="28"/>
-                <w:szCs w:val="28"/>
-              </w:rPr>
-              <w:t>target audience</w:t>
-            </w:r>
-            <w:r>
-              <w:rPr>
-                <w:rFonts w:ascii="Arial" w:hAnsi="Arial" w:eastAsia="Arial" w:cs="Arial"/>
-                <w:sz w:val="28"/>
-                <w:szCs w:val="28"/>
-              </w:rPr>
-              <w:t>.</w:t>
+                <w:rFonts w:ascii="Arial" w:eastAsia="Arial" w:hAnsi="Arial" w:cs="Arial"/>
+                <w:sz w:val="28"/>
+                <w:szCs w:val="28"/>
+              </w:rPr>
+              <w:t xml:space="preserve">The target audience </w:t>
+            </w:r>
+            <w:r>
+              <w:rPr>
+                <w:rFonts w:ascii="Arial" w:eastAsia="Arial" w:hAnsi="Arial" w:cs="Arial"/>
+                <w:sz w:val="28"/>
+                <w:szCs w:val="28"/>
+              </w:rPr>
+              <w:t xml:space="preserve">for my presentation is </w:t>
+            </w:r>
+            <w:proofErr w:type="gramStart"/>
+            <w:r>
+              <w:rPr>
+                <w:rFonts w:ascii="Arial" w:eastAsia="Arial" w:hAnsi="Arial" w:cs="Arial"/>
+                <w:sz w:val="28"/>
+                <w:szCs w:val="28"/>
+              </w:rPr>
+              <w:t>decision-</w:t>
+            </w:r>
+            <w:r>
+              <w:rPr>
+                <w:rFonts w:ascii="Arial" w:eastAsia="Arial" w:hAnsi="Arial" w:cs="Arial"/>
+                <w:sz w:val="28"/>
+                <w:szCs w:val="28"/>
+              </w:rPr>
+              <w:t>makers</w:t>
+            </w:r>
+            <w:proofErr w:type="gramEnd"/>
+            <w:r>
+              <w:rPr>
+                <w:rFonts w:ascii="Arial" w:eastAsia="Arial" w:hAnsi="Arial" w:cs="Arial"/>
+                <w:sz w:val="28"/>
+                <w:szCs w:val="28"/>
+              </w:rPr>
+              <w:t xml:space="preserve"> in the Arizona Diamondbacks Baseball Front </w:t>
+            </w:r>
+            <w:r>
+              <w:rPr>
+                <w:rFonts w:ascii="Arial" w:eastAsia="Arial" w:hAnsi="Arial" w:cs="Arial"/>
+                <w:sz w:val="28"/>
+                <w:szCs w:val="28"/>
+              </w:rPr>
+              <w:t>O</w:t>
+            </w:r>
+            <w:r>
+              <w:rPr>
+                <w:rFonts w:ascii="Arial" w:eastAsia="Arial" w:hAnsi="Arial" w:cs="Arial"/>
+                <w:sz w:val="28"/>
+                <w:szCs w:val="28"/>
+              </w:rPr>
+              <w:t xml:space="preserve">ffice. The key decision makers are Derrick Hall and Mike Hazen, along with their support staff. They </w:t>
+            </w:r>
+            <w:r>
+              <w:rPr>
+                <w:rFonts w:ascii="Arial" w:eastAsia="Arial" w:hAnsi="Arial" w:cs="Arial"/>
+                <w:sz w:val="28"/>
+                <w:szCs w:val="28"/>
+              </w:rPr>
+              <w:t>oversee</w:t>
+            </w:r>
+            <w:r>
+              <w:rPr>
+                <w:rFonts w:ascii="Arial" w:eastAsia="Arial" w:hAnsi="Arial" w:cs="Arial"/>
+                <w:sz w:val="28"/>
+                <w:szCs w:val="28"/>
+              </w:rPr>
+              <w:t xml:space="preserve"> team operations and staffing decisions. My presentation aims to persuade some of those decisions.</w:t>
             </w:r>
           </w:p>
         </w:tc>
@@ -534,12 +565,11 @@
         <w:tc>
           <w:tcPr>
             <w:tcW w:w="4680" w:type="dxa"/>
-            <w:tcMar/>
           </w:tcPr>
           <w:p>
             <w:pPr>
               <w:rPr>
-                <w:rFonts w:ascii="Arial" w:hAnsi="Arial" w:eastAsia="Arial" w:cs="Arial"/>
+                <w:rFonts w:ascii="Arial" w:eastAsia="Arial" w:hAnsi="Arial" w:cs="Arial"/>
                 <w:color w:val="000000" w:themeColor="text1"/>
                 <w:sz w:val="28"/>
                 <w:szCs w:val="28"/>
@@ -547,7 +577,7 @@
             </w:pPr>
             <w:r>
               <w:rPr>
-                <w:rFonts w:ascii="Arial" w:hAnsi="Arial" w:eastAsia="Arial" w:cs="Arial"/>
+                <w:rFonts w:ascii="Arial" w:eastAsia="Arial" w:hAnsi="Arial" w:cs="Arial"/>
                 <w:b/>
                 <w:bCs/>
                 <w:color w:val="000000" w:themeColor="text1"/>
@@ -558,7 +588,7 @@
             </w:r>
             <w:r>
               <w:rPr>
-                <w:rFonts w:ascii="Arial" w:hAnsi="Arial" w:eastAsia="Arial" w:cs="Arial"/>
+                <w:rFonts w:ascii="Arial" w:eastAsia="Arial" w:hAnsi="Arial" w:cs="Arial"/>
                 <w:color w:val="000000" w:themeColor="text1"/>
                 <w:sz w:val="28"/>
                 <w:szCs w:val="28"/>
@@ -567,7 +597,7 @@
             </w:r>
             <w:r>
               <w:rPr>
-                <w:rFonts w:ascii="Arial" w:hAnsi="Arial" w:eastAsia="Arial" w:cs="Arial"/>
+                <w:rFonts w:ascii="Arial" w:eastAsia="Arial" w:hAnsi="Arial" w:cs="Arial"/>
                 <w:color w:val="000000" w:themeColor="text1"/>
                 <w:sz w:val="28"/>
                 <w:szCs w:val="28"/>
@@ -579,39 +609,22 @@
         <w:tc>
           <w:tcPr>
             <w:tcW w:w="4680" w:type="dxa"/>
-            <w:tcMar/>
           </w:tcPr>
           <w:p>
             <w:pPr>
               <w:rPr>
-                <w:rFonts w:ascii="Arial" w:hAnsi="Arial" w:eastAsia="Arial" w:cs="Arial"/>
+                <w:rFonts w:ascii="Arial" w:eastAsia="Arial" w:hAnsi="Arial" w:cs="Arial"/>
                 <w:sz w:val="28"/>
                 <w:szCs w:val="28"/>
               </w:rPr>
             </w:pPr>
             <w:r>
               <w:rPr>
-                <w:rFonts w:ascii="Arial" w:hAnsi="Arial" w:eastAsia="Arial" w:cs="Arial"/>
-                <w:sz w:val="28"/>
-                <w:szCs w:val="28"/>
-              </w:rPr>
-              <w:t xml:space="preserve">Briefly explain </w:t>
-            </w:r>
-            <w:r>
-              <w:rPr>
-                <w:rFonts w:ascii="Arial" w:hAnsi="Arial" w:eastAsia="Arial" w:cs="Arial"/>
-                <w:sz w:val="28"/>
-                <w:szCs w:val="28"/>
-              </w:rPr>
-              <w:t>the presentation’s goal</w:t>
-            </w:r>
-            <w:r>
-              <w:rPr>
-                <w:rFonts w:ascii="Arial" w:hAnsi="Arial" w:eastAsia="Arial" w:cs="Arial"/>
-                <w:sz w:val="28"/>
-                <w:szCs w:val="28"/>
-              </w:rPr>
-              <w:t>.</w:t>
+                <w:rFonts w:ascii="Arial" w:eastAsia="Arial" w:hAnsi="Arial" w:cs="Arial"/>
+                <w:sz w:val="28"/>
+                <w:szCs w:val="28"/>
+              </w:rPr>
+              <w:t>The goal of my presentation is to persuade decision makers in the Arizona Diamondbacks organization to offer a new contract to manager Torrey Lovullo for the next 3 seasons.</w:t>
             </w:r>
           </w:p>
         </w:tc>
@@ -623,12 +636,11 @@
         <w:tc>
           <w:tcPr>
             <w:tcW w:w="4680" w:type="dxa"/>
-            <w:tcMar/>
           </w:tcPr>
           <w:p>
             <w:pPr>
               <w:rPr>
-                <w:rFonts w:ascii="Arial" w:hAnsi="Arial" w:eastAsia="Arial" w:cs="Arial"/>
+                <w:rFonts w:ascii="Arial" w:eastAsia="Arial" w:hAnsi="Arial" w:cs="Arial"/>
                 <w:color w:val="000000" w:themeColor="text1"/>
                 <w:sz w:val="28"/>
                 <w:szCs w:val="28"/>
@@ -636,10 +648,10 @@
             </w:pPr>
             <w:r>
               <w:rPr>
-                <w:rFonts w:ascii="Arial" w:hAnsi="Arial" w:eastAsia="Arial" w:cs="Arial"/>
-                <w:b w:val="1"/>
-                <w:bCs w:val="1"/>
-                <w:color w:val="000000" w:themeColor="text1" w:themeTint="FF" w:themeShade="FF"/>
+                <w:rFonts w:ascii="Arial" w:eastAsia="Arial" w:hAnsi="Arial" w:cs="Arial"/>
+                <w:b/>
+                <w:bCs/>
+                <w:color w:val="000000" w:themeColor="text1"/>
                 <w:sz w:val="28"/>
                 <w:szCs w:val="28"/>
               </w:rPr>
@@ -647,10 +659,10 @@
             </w:r>
             <w:r>
               <w:rPr>
-                <w:rFonts w:ascii="Arial" w:hAnsi="Arial" w:eastAsia="Arial" w:cs="Arial"/>
-                <w:b w:val="1"/>
-                <w:bCs w:val="1"/>
-                <w:color w:val="000000" w:themeColor="text1" w:themeTint="FF" w:themeShade="FF"/>
+                <w:rFonts w:ascii="Arial" w:eastAsia="Arial" w:hAnsi="Arial" w:cs="Arial"/>
+                <w:b/>
+                <w:bCs/>
+                <w:color w:val="000000" w:themeColor="text1"/>
                 <w:sz w:val="28"/>
                 <w:szCs w:val="28"/>
               </w:rPr>
@@ -658,8 +670,8 @@
             </w:r>
             <w:r>
               <w:rPr>
-                <w:rFonts w:ascii="Arial" w:hAnsi="Arial" w:eastAsia="Arial" w:cs="Arial"/>
-                <w:color w:val="000000" w:themeColor="text1" w:themeTint="FF" w:themeShade="FF"/>
+                <w:rFonts w:ascii="Arial" w:eastAsia="Arial" w:hAnsi="Arial" w:cs="Arial"/>
+                <w:color w:val="000000" w:themeColor="text1"/>
                 <w:sz w:val="28"/>
                 <w:szCs w:val="28"/>
               </w:rPr>
@@ -667,10 +679,10 @@
             </w:r>
             <w:r>
               <w:rPr>
-                <w:rFonts w:ascii="Arial" w:hAnsi="Arial" w:eastAsia="Arial" w:cs="Arial"/>
-                <w:b w:val="1"/>
-                <w:bCs w:val="1"/>
-                <w:color w:val="000000" w:themeColor="text1" w:themeTint="FF" w:themeShade="FF"/>
+                <w:rFonts w:ascii="Arial" w:eastAsia="Arial" w:hAnsi="Arial" w:cs="Arial"/>
+                <w:b/>
+                <w:bCs/>
+                <w:color w:val="000000" w:themeColor="text1"/>
                 <w:sz w:val="28"/>
                 <w:szCs w:val="28"/>
               </w:rPr>
@@ -678,8 +690,8 @@
             </w:r>
             <w:r>
               <w:rPr>
-                <w:rFonts w:ascii="Arial" w:hAnsi="Arial" w:eastAsia="Arial" w:cs="Arial"/>
-                <w:color w:val="000000" w:themeColor="text1" w:themeTint="FF" w:themeShade="FF"/>
+                <w:rFonts w:ascii="Arial" w:eastAsia="Arial" w:hAnsi="Arial" w:cs="Arial"/>
+                <w:color w:val="000000" w:themeColor="text1"/>
                 <w:sz w:val="28"/>
                 <w:szCs w:val="28"/>
               </w:rPr>
@@ -687,8 +699,8 @@
             </w:r>
             <w:r>
               <w:rPr>
-                <w:rFonts w:ascii="Arial" w:hAnsi="Arial" w:eastAsia="Arial" w:cs="Arial"/>
-                <w:color w:val="000000" w:themeColor="text1" w:themeTint="FF" w:themeShade="FF"/>
+                <w:rFonts w:ascii="Arial" w:eastAsia="Arial" w:hAnsi="Arial" w:cs="Arial"/>
+                <w:color w:val="000000" w:themeColor="text1"/>
                 <w:sz w:val="28"/>
                 <w:szCs w:val="28"/>
               </w:rPr>
@@ -696,8 +708,8 @@
             </w:r>
             <w:r>
               <w:rPr>
-                <w:rFonts w:ascii="Arial" w:hAnsi="Arial" w:eastAsia="Arial" w:cs="Arial"/>
-                <w:color w:val="000000" w:themeColor="text1" w:themeTint="FF" w:themeShade="FF"/>
+                <w:rFonts w:ascii="Arial" w:eastAsia="Arial" w:hAnsi="Arial" w:cs="Arial"/>
+                <w:color w:val="000000" w:themeColor="text1"/>
                 <w:sz w:val="28"/>
                 <w:szCs w:val="28"/>
               </w:rPr>
@@ -705,10 +717,10 @@
             </w:r>
             <w:r>
               <w:rPr>
-                <w:rFonts w:ascii="Arial" w:hAnsi="Arial" w:eastAsia="Arial" w:cs="Arial"/>
-                <w:b w:val="1"/>
-                <w:bCs w:val="1"/>
-                <w:color w:val="000000" w:themeColor="text1" w:themeTint="FF" w:themeShade="FF"/>
+                <w:rFonts w:ascii="Arial" w:eastAsia="Arial" w:hAnsi="Arial" w:cs="Arial"/>
+                <w:b/>
+                <w:bCs/>
+                <w:color w:val="000000" w:themeColor="text1"/>
                 <w:sz w:val="28"/>
                 <w:szCs w:val="28"/>
               </w:rPr>
@@ -716,10 +728,10 @@
             </w:r>
             <w:r>
               <w:rPr>
-                <w:rFonts w:ascii="Arial" w:hAnsi="Arial" w:eastAsia="Arial" w:cs="Arial"/>
-                <w:b w:val="1"/>
-                <w:bCs w:val="1"/>
-                <w:color w:val="000000" w:themeColor="text1" w:themeTint="FF" w:themeShade="FF"/>
+                <w:rFonts w:ascii="Arial" w:eastAsia="Arial" w:hAnsi="Arial" w:cs="Arial"/>
+                <w:b/>
+                <w:bCs/>
+                <w:color w:val="000000" w:themeColor="text1"/>
                 <w:sz w:val="28"/>
                 <w:szCs w:val="28"/>
               </w:rPr>
@@ -727,10 +739,10 @@
             </w:r>
             <w:r>
               <w:rPr>
-                <w:rFonts w:ascii="Arial" w:hAnsi="Arial" w:eastAsia="Arial" w:cs="Arial"/>
-                <w:b w:val="1"/>
-                <w:bCs w:val="1"/>
-                <w:color w:val="000000" w:themeColor="text1" w:themeTint="FF" w:themeShade="FF"/>
+                <w:rFonts w:ascii="Arial" w:eastAsia="Arial" w:hAnsi="Arial" w:cs="Arial"/>
+                <w:b/>
+                <w:bCs/>
+                <w:color w:val="000000" w:themeColor="text1"/>
                 <w:sz w:val="28"/>
                 <w:szCs w:val="28"/>
               </w:rPr>
@@ -738,10 +750,10 @@
             </w:r>
             <w:r>
               <w:rPr>
-                <w:rFonts w:ascii="Arial" w:hAnsi="Arial" w:eastAsia="Arial" w:cs="Arial"/>
-                <w:b w:val="1"/>
-                <w:bCs w:val="1"/>
-                <w:color w:val="000000" w:themeColor="text1" w:themeTint="FF" w:themeShade="FF"/>
+                <w:rFonts w:ascii="Arial" w:eastAsia="Arial" w:hAnsi="Arial" w:cs="Arial"/>
+                <w:b/>
+                <w:bCs/>
+                <w:color w:val="000000" w:themeColor="text1"/>
                 <w:sz w:val="28"/>
                 <w:szCs w:val="28"/>
               </w:rPr>
@@ -749,8 +761,8 @@
             </w:r>
             <w:r>
               <w:rPr>
-                <w:rFonts w:ascii="Arial" w:hAnsi="Arial" w:eastAsia="Arial" w:cs="Arial"/>
-                <w:color w:val="000000" w:themeColor="text1" w:themeTint="FF" w:themeShade="FF"/>
+                <w:rFonts w:ascii="Arial" w:eastAsia="Arial" w:hAnsi="Arial" w:cs="Arial"/>
+                <w:color w:val="000000" w:themeColor="text1"/>
                 <w:sz w:val="28"/>
                 <w:szCs w:val="28"/>
               </w:rPr>
@@ -760,7 +772,7 @@
           <w:p>
             <w:pPr>
               <w:rPr>
-                <w:rFonts w:ascii="Arial" w:hAnsi="Arial" w:eastAsia="Arial" w:cs="Arial"/>
+                <w:rFonts w:ascii="Arial" w:eastAsia="Arial" w:hAnsi="Arial" w:cs="Arial"/>
                 <w:color w:val="000000" w:themeColor="text1"/>
                 <w:sz w:val="28"/>
                 <w:szCs w:val="28"/>
@@ -770,7 +782,7 @@
           <w:p>
             <w:pPr>
               <w:rPr>
-                <w:rFonts w:ascii="Arial" w:hAnsi="Arial" w:eastAsia="Arial" w:cs="Arial"/>
+                <w:rFonts w:ascii="Arial" w:eastAsia="Arial" w:hAnsi="Arial" w:cs="Arial"/>
                 <w:color w:val="000000" w:themeColor="text1"/>
                 <w:sz w:val="28"/>
                 <w:szCs w:val="28"/>
@@ -778,28 +790,19 @@
             </w:pPr>
             <w:r>
               <w:rPr>
-                <w:rFonts w:ascii="Arial" w:hAnsi="Arial" w:eastAsia="Arial" w:cs="Arial"/>
-                <w:color w:val="000000" w:themeColor="text1" w:themeTint="FF" w:themeShade="FF"/>
-                <w:sz w:val="28"/>
-                <w:szCs w:val="28"/>
-              </w:rPr>
-              <w:t>Then</w:t>
-            </w:r>
-            <w:r>
-              <w:rPr>
-                <w:rFonts w:ascii="Arial" w:hAnsi="Arial" w:eastAsia="Arial" w:cs="Arial"/>
-                <w:color w:val="000000" w:themeColor="text1" w:themeTint="FF" w:themeShade="FF"/>
-                <w:sz w:val="28"/>
-                <w:szCs w:val="28"/>
-              </w:rPr>
-              <w:t>, explain how the technique will motivate, inform, or influence the audience. </w:t>
-            </w:r>
-            <w:r>
-              <w:rPr>
-                <w:rFonts w:ascii="Arial" w:hAnsi="Arial" w:eastAsia="Arial" w:cs="Arial"/>
-                <w:b w:val="1"/>
-                <w:bCs w:val="1"/>
-                <w:color w:val="000000" w:themeColor="text1" w:themeTint="FF" w:themeShade="FF"/>
+                <w:rFonts w:ascii="Arial" w:eastAsia="Arial" w:hAnsi="Arial" w:cs="Arial"/>
+                <w:color w:val="000000" w:themeColor="text1"/>
+                <w:sz w:val="28"/>
+                <w:szCs w:val="28"/>
+              </w:rPr>
+              <w:t>Then, explain how the technique will motivate, inform, or influence the audience. </w:t>
+            </w:r>
+            <w:r>
+              <w:rPr>
+                <w:rFonts w:ascii="Arial" w:eastAsia="Arial" w:hAnsi="Arial" w:cs="Arial"/>
+                <w:b/>
+                <w:bCs/>
+                <w:color w:val="000000" w:themeColor="text1"/>
                 <w:sz w:val="28"/>
                 <w:szCs w:val="28"/>
               </w:rPr>
@@ -807,10 +810,10 @@
             </w:r>
             <w:r>
               <w:rPr>
-                <w:rFonts w:ascii="Arial" w:hAnsi="Arial" w:eastAsia="Arial" w:cs="Arial"/>
-                <w:b w:val="1"/>
-                <w:bCs w:val="1"/>
-                <w:color w:val="000000" w:themeColor="text1" w:themeTint="FF" w:themeShade="FF"/>
+                <w:rFonts w:ascii="Arial" w:eastAsia="Arial" w:hAnsi="Arial" w:cs="Arial"/>
+                <w:b/>
+                <w:bCs/>
+                <w:color w:val="000000" w:themeColor="text1"/>
                 <w:sz w:val="28"/>
                 <w:szCs w:val="28"/>
               </w:rPr>
@@ -818,10 +821,10 @@
             </w:r>
             <w:r>
               <w:rPr>
-                <w:rFonts w:ascii="Arial" w:hAnsi="Arial" w:eastAsia="Arial" w:cs="Arial"/>
-                <w:b w:val="1"/>
-                <w:bCs w:val="1"/>
-                <w:color w:val="000000" w:themeColor="text1" w:themeTint="FF" w:themeShade="FF"/>
+                <w:rFonts w:ascii="Arial" w:eastAsia="Arial" w:hAnsi="Arial" w:cs="Arial"/>
+                <w:b/>
+                <w:bCs/>
+                <w:color w:val="000000" w:themeColor="text1"/>
                 <w:sz w:val="28"/>
                 <w:szCs w:val="28"/>
               </w:rPr>
@@ -829,8 +832,8 @@
             </w:r>
             <w:r>
               <w:rPr>
-                <w:rFonts w:ascii="Arial" w:hAnsi="Arial" w:eastAsia="Arial" w:cs="Arial"/>
-                <w:color w:val="000000" w:themeColor="text1" w:themeTint="FF" w:themeShade="FF"/>
+                <w:rFonts w:ascii="Arial" w:eastAsia="Arial" w:hAnsi="Arial" w:cs="Arial"/>
+                <w:color w:val="000000" w:themeColor="text1"/>
                 <w:sz w:val="28"/>
                 <w:szCs w:val="28"/>
               </w:rPr>
@@ -841,71 +844,114 @@
         <w:tc>
           <w:tcPr>
             <w:tcW w:w="4680" w:type="dxa"/>
-            <w:tcMar/>
           </w:tcPr>
           <w:p>
             <w:pPr>
               <w:rPr>
-                <w:rFonts w:ascii="Arial" w:hAnsi="Arial" w:eastAsia="Arial" w:cs="Arial"/>
+                <w:rFonts w:ascii="Arial" w:eastAsia="Arial" w:hAnsi="Arial" w:cs="Arial"/>
                 <w:sz w:val="28"/>
                 <w:szCs w:val="28"/>
               </w:rPr>
             </w:pPr>
             <w:r>
               <w:rPr>
-                <w:rFonts w:ascii="Arial" w:hAnsi="Arial" w:eastAsia="Arial" w:cs="Arial"/>
-                <w:sz w:val="28"/>
-                <w:szCs w:val="28"/>
-              </w:rPr>
-              <w:t>Write about</w:t>
-            </w:r>
-            <w:r>
-              <w:rPr>
-                <w:rFonts w:ascii="Arial" w:hAnsi="Arial" w:eastAsia="Arial" w:cs="Arial"/>
-                <w:sz w:val="28"/>
-                <w:szCs w:val="28"/>
-              </w:rPr>
-              <w:t xml:space="preserve"> the</w:t>
-            </w:r>
-            <w:r>
-              <w:rPr>
-                <w:rFonts w:ascii="Arial" w:hAnsi="Arial" w:eastAsia="Arial" w:cs="Arial"/>
-                <w:sz w:val="28"/>
-                <w:szCs w:val="28"/>
-              </w:rPr>
-              <w:t xml:space="preserve"> communication style</w:t>
-            </w:r>
-            <w:r>
-              <w:rPr>
-                <w:rFonts w:ascii="Arial" w:hAnsi="Arial" w:eastAsia="Arial" w:cs="Arial"/>
-                <w:sz w:val="28"/>
-                <w:szCs w:val="28"/>
-              </w:rPr>
-              <w:t xml:space="preserve"> </w:t>
-            </w:r>
-            <w:r>
-              <w:rPr>
-                <w:rFonts w:ascii="Arial" w:hAnsi="Arial" w:eastAsia="Arial" w:cs="Arial"/>
-                <w:sz w:val="28"/>
-                <w:szCs w:val="28"/>
-              </w:rPr>
-              <w:t xml:space="preserve">you chose </w:t>
-            </w:r>
-            <w:r>
-              <w:rPr>
-                <w:rFonts w:ascii="Arial" w:hAnsi="Arial" w:eastAsia="Arial" w:cs="Arial"/>
-                <w:sz w:val="28"/>
-                <w:szCs w:val="28"/>
-              </w:rPr>
-              <w:t>for your presentation.</w:t>
-            </w:r>
-            <w:r>
-              <w:rPr>
-                <w:rFonts w:ascii="Arial" w:hAnsi="Arial" w:eastAsia="Arial" w:cs="Arial"/>
-                <w:sz w:val="28"/>
-                <w:szCs w:val="28"/>
-              </w:rPr>
-              <w:t xml:space="preserve"> </w:t>
+                <w:rFonts w:ascii="Arial" w:eastAsia="Arial" w:hAnsi="Arial" w:cs="Arial"/>
+                <w:sz w:val="28"/>
+                <w:szCs w:val="28"/>
+              </w:rPr>
+              <w:t>I will use the analytical communication style in my presentation.</w:t>
+            </w:r>
+          </w:p>
+          <w:p>
+            <w:pPr>
+              <w:rPr>
+                <w:rFonts w:ascii="Arial" w:eastAsia="Arial" w:hAnsi="Arial" w:cs="Arial"/>
+                <w:sz w:val="28"/>
+                <w:szCs w:val="28"/>
+              </w:rPr>
+            </w:pPr>
+          </w:p>
+          <w:p>
+            <w:pPr>
+              <w:rPr>
+                <w:rFonts w:ascii="Arial" w:eastAsia="Arial" w:hAnsi="Arial" w:cs="Arial"/>
+                <w:sz w:val="28"/>
+                <w:szCs w:val="28"/>
+              </w:rPr>
+            </w:pPr>
+            <w:r>
+              <w:rPr>
+                <w:rFonts w:ascii="Arial" w:eastAsia="Arial" w:hAnsi="Arial" w:cs="Arial"/>
+                <w:sz w:val="28"/>
+                <w:szCs w:val="28"/>
+              </w:rPr>
+              <w:t xml:space="preserve">My presentation will describe </w:t>
+            </w:r>
+            <w:r>
+              <w:rPr>
+                <w:rFonts w:ascii="Arial" w:eastAsia="Arial" w:hAnsi="Arial" w:cs="Arial"/>
+                <w:sz w:val="28"/>
+                <w:szCs w:val="28"/>
+              </w:rPr>
+              <w:t>the "why" of having a great manager on your baseball team, the "how" a man</w:t>
+            </w:r>
+            <w:r>
+              <w:rPr>
+                <w:rFonts w:ascii="Arial" w:eastAsia="Arial" w:hAnsi="Arial" w:cs="Arial"/>
+                <w:sz w:val="28"/>
+                <w:szCs w:val="28"/>
+              </w:rPr>
+              <w:t>a</w:t>
+            </w:r>
+            <w:r>
+              <w:rPr>
+                <w:rFonts w:ascii="Arial" w:eastAsia="Arial" w:hAnsi="Arial" w:cs="Arial"/>
+                <w:sz w:val="28"/>
+                <w:szCs w:val="28"/>
+              </w:rPr>
+              <w:t>ger can be great, and "what" Torey Lovullo does that makes him a great manager.</w:t>
+            </w:r>
+          </w:p>
+          <w:p>
+            <w:pPr>
+              <w:rPr>
+                <w:rFonts w:ascii="Arial" w:eastAsia="Arial" w:hAnsi="Arial" w:cs="Arial"/>
+                <w:sz w:val="28"/>
+                <w:szCs w:val="28"/>
+              </w:rPr>
+            </w:pPr>
+          </w:p>
+          <w:p>
+            <w:pPr>
+              <w:rPr>
+                <w:rFonts w:ascii="Arial" w:eastAsia="Arial" w:hAnsi="Arial" w:cs="Arial"/>
+                <w:sz w:val="28"/>
+                <w:szCs w:val="28"/>
+              </w:rPr>
+            </w:pPr>
+            <w:r>
+              <w:rPr>
+                <w:rFonts w:ascii="Arial" w:eastAsia="Arial" w:hAnsi="Arial" w:cs="Arial"/>
+                <w:sz w:val="28"/>
+                <w:szCs w:val="28"/>
+              </w:rPr>
+              <w:t>This would motivate them to h</w:t>
+            </w:r>
+            <w:r>
+              <w:rPr>
+                <w:rFonts w:ascii="Arial" w:eastAsia="Arial" w:hAnsi="Arial" w:cs="Arial"/>
+                <w:sz w:val="28"/>
+                <w:szCs w:val="28"/>
+              </w:rPr>
+              <w:t>ire a great manager, and a clear explanation of what Torey Lovullo does would influence them to retain him as the Diamondbacks' manager</w:t>
+            </w:r>
+            <w:r>
+              <w:rPr>
+                <w:rFonts w:ascii="Arial" w:eastAsia="Arial" w:hAnsi="Arial" w:cs="Arial"/>
+                <w:sz w:val="28"/>
+                <w:szCs w:val="28"/>
+              </w:rPr>
+              <w:t>.</w:t>
             </w:r>
           </w:p>
         </w:tc>
@@ -917,14 +963,13 @@
         <w:tc>
           <w:tcPr>
             <w:tcW w:w="4680" w:type="dxa"/>
-            <w:tcMar/>
           </w:tcPr>
           <w:p>
             <w:pPr>
               <w:rPr>
-                <w:rFonts w:ascii="Arial" w:hAnsi="Arial" w:eastAsia="Arial" w:cs="Arial"/>
-                <w:b w:val="1"/>
-                <w:bCs w:val="1"/>
+                <w:rFonts w:ascii="Arial" w:eastAsia="Arial" w:hAnsi="Arial" w:cs="Arial"/>
+                <w:b/>
+                <w:bCs/>
                 <w:color w:val="000000" w:themeColor="text1"/>
                 <w:sz w:val="28"/>
                 <w:szCs w:val="28"/>
@@ -932,21 +977,22 @@
             </w:pPr>
             <w:r>
               <w:rPr>
-                <w:rFonts w:ascii="Arial" w:hAnsi="Arial" w:eastAsia="Arial" w:cs="Arial"/>
-                <w:b w:val="1"/>
-                <w:bCs w:val="1"/>
-                <w:color w:val="000000" w:themeColor="text1" w:themeTint="FF" w:themeShade="FF"/>
-                <w:sz w:val="28"/>
-                <w:szCs w:val="28"/>
-              </w:rPr>
+                <w:rFonts w:ascii="Arial" w:eastAsia="Arial" w:hAnsi="Arial" w:cs="Arial"/>
+                <w:b/>
+                <w:bCs/>
+                <w:color w:val="000000" w:themeColor="text1"/>
+                <w:sz w:val="28"/>
+                <w:szCs w:val="28"/>
+              </w:rPr>
+              <w:lastRenderedPageBreak/>
               <w:t>A3</w:t>
             </w:r>
             <w:r>
               <w:rPr>
-                <w:rFonts w:ascii="Arial" w:hAnsi="Arial" w:eastAsia="Arial" w:cs="Arial"/>
-                <w:b w:val="1"/>
-                <w:bCs w:val="1"/>
-                <w:color w:val="000000" w:themeColor="text1" w:themeTint="FF" w:themeShade="FF"/>
+                <w:rFonts w:ascii="Arial" w:eastAsia="Arial" w:hAnsi="Arial" w:cs="Arial"/>
+                <w:b/>
+                <w:bCs/>
+                <w:color w:val="000000" w:themeColor="text1"/>
                 <w:sz w:val="28"/>
                 <w:szCs w:val="28"/>
               </w:rPr>
@@ -954,8 +1000,8 @@
             </w:r>
             <w:r>
               <w:rPr>
-                <w:rFonts w:ascii="Arial" w:hAnsi="Arial" w:eastAsia="Arial" w:cs="Arial"/>
-                <w:color w:val="000000" w:themeColor="text1" w:themeTint="FF" w:themeShade="FF"/>
+                <w:rFonts w:ascii="Arial" w:eastAsia="Arial" w:hAnsi="Arial" w:cs="Arial"/>
+                <w:color w:val="000000" w:themeColor="text1"/>
                 <w:sz w:val="28"/>
                 <w:szCs w:val="28"/>
               </w:rPr>
@@ -963,8 +1009,8 @@
             </w:r>
             <w:r>
               <w:rPr>
-                <w:rFonts w:ascii="Arial" w:hAnsi="Arial" w:eastAsia="Arial" w:cs="Arial"/>
-                <w:color w:val="000000" w:themeColor="text1" w:themeTint="FF" w:themeShade="FF"/>
+                <w:rFonts w:ascii="Arial" w:eastAsia="Arial" w:hAnsi="Arial" w:cs="Arial"/>
+                <w:color w:val="000000" w:themeColor="text1"/>
                 <w:sz w:val="28"/>
                 <w:szCs w:val="28"/>
               </w:rPr>
@@ -972,8 +1018,8 @@
             </w:r>
             <w:r>
               <w:rPr>
-                <w:rFonts w:ascii="Arial" w:hAnsi="Arial" w:eastAsia="Arial" w:cs="Arial"/>
-                <w:color w:val="000000" w:themeColor="text1" w:themeTint="FF" w:themeShade="FF"/>
+                <w:rFonts w:ascii="Arial" w:eastAsia="Arial" w:hAnsi="Arial" w:cs="Arial"/>
+                <w:color w:val="000000" w:themeColor="text1"/>
                 <w:sz w:val="28"/>
                 <w:szCs w:val="28"/>
               </w:rPr>
@@ -981,8 +1027,8 @@
             </w:r>
             <w:r>
               <w:rPr>
-                <w:rFonts w:ascii="Arial" w:hAnsi="Arial" w:eastAsia="Arial" w:cs="Arial"/>
-                <w:color w:val="000000" w:themeColor="text1" w:themeTint="FF" w:themeShade="FF"/>
+                <w:rFonts w:ascii="Arial" w:eastAsia="Arial" w:hAnsi="Arial" w:cs="Arial"/>
+                <w:color w:val="000000" w:themeColor="text1"/>
                 <w:sz w:val="28"/>
                 <w:szCs w:val="28"/>
               </w:rPr>
@@ -990,8 +1036,8 @@
             </w:r>
             <w:r>
               <w:rPr>
-                <w:rFonts w:ascii="Arial" w:hAnsi="Arial" w:eastAsia="Arial" w:cs="Arial"/>
-                <w:color w:val="000000" w:themeColor="text1" w:themeTint="FF" w:themeShade="FF"/>
+                <w:rFonts w:ascii="Arial" w:eastAsia="Arial" w:hAnsi="Arial" w:cs="Arial"/>
+                <w:color w:val="000000" w:themeColor="text1"/>
                 <w:sz w:val="28"/>
                 <w:szCs w:val="28"/>
               </w:rPr>
@@ -999,8 +1045,8 @@
             </w:r>
             <w:r>
               <w:rPr>
-                <w:rFonts w:ascii="Arial" w:hAnsi="Arial" w:eastAsia="Arial" w:cs="Arial"/>
-                <w:color w:val="000000" w:themeColor="text1" w:themeTint="FF" w:themeShade="FF"/>
+                <w:rFonts w:ascii="Arial" w:eastAsia="Arial" w:hAnsi="Arial" w:cs="Arial"/>
+                <w:color w:val="000000" w:themeColor="text1"/>
                 <w:sz w:val="28"/>
                 <w:szCs w:val="28"/>
               </w:rPr>
@@ -1008,8 +1054,8 @@
             </w:r>
             <w:r>
               <w:rPr>
-                <w:rFonts w:ascii="Arial" w:hAnsi="Arial" w:eastAsia="Arial" w:cs="Arial"/>
-                <w:color w:val="000000" w:themeColor="text1" w:themeTint="FF" w:themeShade="FF"/>
+                <w:rFonts w:ascii="Arial" w:eastAsia="Arial" w:hAnsi="Arial" w:cs="Arial"/>
+                <w:color w:val="000000" w:themeColor="text1"/>
                 <w:sz w:val="28"/>
                 <w:szCs w:val="28"/>
               </w:rPr>
@@ -1017,10 +1063,10 @@
             </w:r>
             <w:r>
               <w:rPr>
-                <w:rFonts w:ascii="Arial" w:hAnsi="Arial" w:eastAsia="Arial" w:cs="Arial"/>
-                <w:b w:val="1"/>
-                <w:bCs w:val="1"/>
-                <w:color w:val="000000" w:themeColor="text1" w:themeTint="FF" w:themeShade="FF"/>
+                <w:rFonts w:ascii="Arial" w:eastAsia="Arial" w:hAnsi="Arial" w:cs="Arial"/>
+                <w:b/>
+                <w:bCs/>
+                <w:color w:val="000000" w:themeColor="text1"/>
                 <w:sz w:val="28"/>
                 <w:szCs w:val="28"/>
               </w:rPr>
@@ -1028,10 +1074,10 @@
             </w:r>
             <w:r>
               <w:rPr>
-                <w:rFonts w:ascii="Arial" w:hAnsi="Arial" w:eastAsia="Arial" w:cs="Arial"/>
-                <w:b w:val="1"/>
-                <w:bCs w:val="1"/>
-                <w:color w:val="000000" w:themeColor="text1" w:themeTint="FF" w:themeShade="FF"/>
+                <w:rFonts w:ascii="Arial" w:eastAsia="Arial" w:hAnsi="Arial" w:cs="Arial"/>
+                <w:b/>
+                <w:bCs/>
+                <w:color w:val="000000" w:themeColor="text1"/>
                 <w:sz w:val="28"/>
                 <w:szCs w:val="28"/>
               </w:rPr>
@@ -1039,10 +1085,10 @@
             </w:r>
             <w:r>
               <w:rPr>
-                <w:rFonts w:ascii="Arial" w:hAnsi="Arial" w:eastAsia="Arial" w:cs="Arial"/>
-                <w:b w:val="1"/>
-                <w:bCs w:val="1"/>
-                <w:color w:val="000000" w:themeColor="text1" w:themeTint="FF" w:themeShade="FF"/>
+                <w:rFonts w:ascii="Arial" w:eastAsia="Arial" w:hAnsi="Arial" w:cs="Arial"/>
+                <w:b/>
+                <w:bCs/>
+                <w:color w:val="000000" w:themeColor="text1"/>
                 <w:sz w:val="28"/>
                 <w:szCs w:val="28"/>
               </w:rPr>
@@ -1050,10 +1096,10 @@
             </w:r>
             <w:r>
               <w:rPr>
-                <w:rFonts w:ascii="Arial" w:hAnsi="Arial" w:eastAsia="Arial" w:cs="Arial"/>
-                <w:b w:val="1"/>
-                <w:bCs w:val="1"/>
-                <w:color w:val="000000" w:themeColor="text1" w:themeTint="FF" w:themeShade="FF"/>
+                <w:rFonts w:ascii="Arial" w:eastAsia="Arial" w:hAnsi="Arial" w:cs="Arial"/>
+                <w:b/>
+                <w:bCs/>
+                <w:color w:val="000000" w:themeColor="text1"/>
                 <w:sz w:val="28"/>
                 <w:szCs w:val="28"/>
               </w:rPr>
@@ -1061,10 +1107,10 @@
             </w:r>
             <w:r>
               <w:rPr>
-                <w:rFonts w:ascii="Arial" w:hAnsi="Arial" w:eastAsia="Arial" w:cs="Arial"/>
-                <w:b w:val="1"/>
-                <w:bCs w:val="1"/>
-                <w:color w:val="000000" w:themeColor="text1" w:themeTint="FF" w:themeShade="FF"/>
+                <w:rFonts w:ascii="Arial" w:eastAsia="Arial" w:hAnsi="Arial" w:cs="Arial"/>
+                <w:b/>
+                <w:bCs/>
+                <w:color w:val="000000" w:themeColor="text1"/>
                 <w:sz w:val="28"/>
                 <w:szCs w:val="28"/>
               </w:rPr>
@@ -1072,10 +1118,10 @@
             </w:r>
             <w:r>
               <w:rPr>
-                <w:rFonts w:ascii="Arial" w:hAnsi="Arial" w:eastAsia="Arial" w:cs="Arial"/>
-                <w:b w:val="1"/>
-                <w:bCs w:val="1"/>
-                <w:color w:val="000000" w:themeColor="text1" w:themeTint="FF" w:themeShade="FF"/>
+                <w:rFonts w:ascii="Arial" w:eastAsia="Arial" w:hAnsi="Arial" w:cs="Arial"/>
+                <w:b/>
+                <w:bCs/>
+                <w:color w:val="000000" w:themeColor="text1"/>
                 <w:sz w:val="28"/>
                 <w:szCs w:val="28"/>
               </w:rPr>
@@ -1083,10 +1129,10 @@
             </w:r>
             <w:r>
               <w:rPr>
-                <w:rFonts w:ascii="Arial" w:hAnsi="Arial" w:eastAsia="Arial" w:cs="Arial"/>
-                <w:b w:val="1"/>
-                <w:bCs w:val="1"/>
-                <w:color w:val="000000" w:themeColor="text1" w:themeTint="FF" w:themeShade="FF"/>
+                <w:rFonts w:ascii="Arial" w:eastAsia="Arial" w:hAnsi="Arial" w:cs="Arial"/>
+                <w:b/>
+                <w:bCs/>
+                <w:color w:val="000000" w:themeColor="text1"/>
                 <w:sz w:val="28"/>
                 <w:szCs w:val="28"/>
               </w:rPr>
@@ -1094,10 +1140,10 @@
             </w:r>
             <w:r>
               <w:rPr>
-                <w:rFonts w:ascii="Arial" w:hAnsi="Arial" w:eastAsia="Arial" w:cs="Arial"/>
-                <w:b w:val="1"/>
-                <w:bCs w:val="1"/>
-                <w:color w:val="000000" w:themeColor="text1" w:themeTint="FF" w:themeShade="FF"/>
+                <w:rFonts w:ascii="Arial" w:eastAsia="Arial" w:hAnsi="Arial" w:cs="Arial"/>
+                <w:b/>
+                <w:bCs/>
+                <w:color w:val="000000" w:themeColor="text1"/>
                 <w:sz w:val="28"/>
                 <w:szCs w:val="28"/>
               </w:rPr>
@@ -1105,10 +1151,10 @@
             </w:r>
             <w:r>
               <w:rPr>
-                <w:rFonts w:ascii="Arial" w:hAnsi="Arial" w:eastAsia="Arial" w:cs="Arial"/>
-                <w:b w:val="1"/>
-                <w:bCs w:val="1"/>
-                <w:color w:val="000000" w:themeColor="text1" w:themeTint="FF" w:themeShade="FF"/>
+                <w:rFonts w:ascii="Arial" w:eastAsia="Arial" w:hAnsi="Arial" w:cs="Arial"/>
+                <w:b/>
+                <w:bCs/>
+                <w:color w:val="000000" w:themeColor="text1"/>
                 <w:sz w:val="28"/>
                 <w:szCs w:val="28"/>
               </w:rPr>
@@ -1118,7 +1164,7 @@
           <w:p>
             <w:pPr>
               <w:rPr>
-                <w:rFonts w:ascii="Arial" w:hAnsi="Arial" w:eastAsia="Arial" w:cs="Arial"/>
+                <w:rFonts w:ascii="Arial" w:eastAsia="Arial" w:hAnsi="Arial" w:cs="Arial"/>
                 <w:color w:val="000000" w:themeColor="text1"/>
                 <w:sz w:val="28"/>
                 <w:szCs w:val="28"/>
@@ -1128,7 +1174,7 @@
           <w:p>
             <w:pPr>
               <w:rPr>
-                <w:rFonts w:ascii="Arial" w:hAnsi="Arial" w:eastAsia="Arial" w:cs="Arial"/>
+                <w:rFonts w:ascii="Arial" w:eastAsia="Arial" w:hAnsi="Arial" w:cs="Arial"/>
                 <w:color w:val="000000" w:themeColor="text1"/>
                 <w:sz w:val="28"/>
                 <w:szCs w:val="28"/>
@@ -1136,8 +1182,8 @@
             </w:pPr>
             <w:r>
               <w:rPr>
-                <w:rFonts w:ascii="Arial" w:hAnsi="Arial" w:eastAsia="Arial" w:cs="Arial"/>
-                <w:color w:val="000000" w:themeColor="text1" w:themeTint="FF" w:themeShade="FF"/>
+                <w:rFonts w:ascii="Arial" w:eastAsia="Arial" w:hAnsi="Arial" w:cs="Arial"/>
+                <w:color w:val="000000" w:themeColor="text1"/>
                 <w:sz w:val="28"/>
                 <w:szCs w:val="28"/>
               </w:rPr>
@@ -1145,8 +1191,8 @@
             </w:r>
             <w:r>
               <w:rPr>
-                <w:rFonts w:ascii="Arial" w:hAnsi="Arial" w:eastAsia="Arial" w:cs="Arial"/>
-                <w:color w:val="000000" w:themeColor="text1" w:themeTint="FF" w:themeShade="FF"/>
+                <w:rFonts w:ascii="Arial" w:eastAsia="Arial" w:hAnsi="Arial" w:cs="Arial"/>
+                <w:color w:val="000000" w:themeColor="text1"/>
                 <w:sz w:val="28"/>
                 <w:szCs w:val="28"/>
               </w:rPr>
@@ -1154,8 +1200,8 @@
             </w:r>
             <w:r>
               <w:rPr>
-                <w:rFonts w:ascii="Arial" w:hAnsi="Arial" w:eastAsia="Arial" w:cs="Arial"/>
-                <w:color w:val="000000" w:themeColor="text1" w:themeTint="FF" w:themeShade="FF"/>
+                <w:rFonts w:ascii="Arial" w:eastAsia="Arial" w:hAnsi="Arial" w:cs="Arial"/>
+                <w:color w:val="000000" w:themeColor="text1"/>
                 <w:sz w:val="28"/>
                 <w:szCs w:val="28"/>
               </w:rPr>
@@ -1163,8 +1209,8 @@
             </w:r>
             <w:r>
               <w:rPr>
-                <w:rFonts w:ascii="Arial" w:hAnsi="Arial" w:eastAsia="Arial" w:cs="Arial"/>
-                <w:color w:val="000000" w:themeColor="text1" w:themeTint="FF" w:themeShade="FF"/>
+                <w:rFonts w:ascii="Arial" w:eastAsia="Arial" w:hAnsi="Arial" w:cs="Arial"/>
+                <w:color w:val="000000" w:themeColor="text1"/>
                 <w:sz w:val="28"/>
                 <w:szCs w:val="28"/>
               </w:rPr>
@@ -1172,8 +1218,8 @@
             </w:r>
             <w:r>
               <w:rPr>
-                <w:rFonts w:ascii="Arial" w:hAnsi="Arial" w:eastAsia="Arial" w:cs="Arial"/>
-                <w:color w:val="000000" w:themeColor="text1" w:themeTint="FF" w:themeShade="FF"/>
+                <w:rFonts w:ascii="Arial" w:eastAsia="Arial" w:hAnsi="Arial" w:cs="Arial"/>
+                <w:color w:val="000000" w:themeColor="text1"/>
                 <w:sz w:val="28"/>
                 <w:szCs w:val="28"/>
               </w:rPr>
@@ -1181,8 +1227,8 @@
             </w:r>
             <w:r>
               <w:rPr>
-                <w:rFonts w:ascii="Arial" w:hAnsi="Arial" w:eastAsia="Arial" w:cs="Arial"/>
-                <w:color w:val="000000" w:themeColor="text1" w:themeTint="FF" w:themeShade="FF"/>
+                <w:rFonts w:ascii="Arial" w:eastAsia="Arial" w:hAnsi="Arial" w:cs="Arial"/>
+                <w:color w:val="000000" w:themeColor="text1"/>
                 <w:sz w:val="28"/>
                 <w:szCs w:val="28"/>
               </w:rPr>
@@ -1190,10 +1236,10 @@
             </w:r>
             <w:r>
               <w:rPr>
-                <w:rFonts w:ascii="Arial" w:hAnsi="Arial" w:eastAsia="Arial" w:cs="Arial"/>
-                <w:b w:val="1"/>
-                <w:bCs w:val="1"/>
-                <w:color w:val="000000" w:themeColor="text1" w:themeTint="FF" w:themeShade="FF"/>
+                <w:rFonts w:ascii="Arial" w:eastAsia="Arial" w:hAnsi="Arial" w:cs="Arial"/>
+                <w:b/>
+                <w:bCs/>
+                <w:color w:val="000000" w:themeColor="text1"/>
                 <w:sz w:val="28"/>
                 <w:szCs w:val="28"/>
               </w:rPr>
@@ -1201,10 +1247,10 @@
             </w:r>
             <w:r>
               <w:rPr>
-                <w:rFonts w:ascii="Arial" w:hAnsi="Arial" w:eastAsia="Arial" w:cs="Arial"/>
-                <w:b w:val="1"/>
-                <w:bCs w:val="1"/>
-                <w:color w:val="000000" w:themeColor="text1" w:themeTint="FF" w:themeShade="FF"/>
+                <w:rFonts w:ascii="Arial" w:eastAsia="Arial" w:hAnsi="Arial" w:cs="Arial"/>
+                <w:b/>
+                <w:bCs/>
+                <w:color w:val="000000" w:themeColor="text1"/>
                 <w:sz w:val="28"/>
                 <w:szCs w:val="28"/>
               </w:rPr>
@@ -1212,10 +1258,10 @@
             </w:r>
             <w:r>
               <w:rPr>
-                <w:rFonts w:ascii="Arial" w:hAnsi="Arial" w:eastAsia="Arial" w:cs="Arial"/>
-                <w:b w:val="1"/>
-                <w:bCs w:val="1"/>
-                <w:color w:val="000000" w:themeColor="text1" w:themeTint="FF" w:themeShade="FF"/>
+                <w:rFonts w:ascii="Arial" w:eastAsia="Arial" w:hAnsi="Arial" w:cs="Arial"/>
+                <w:b/>
+                <w:bCs/>
+                <w:color w:val="000000" w:themeColor="text1"/>
                 <w:sz w:val="28"/>
                 <w:szCs w:val="28"/>
               </w:rPr>
@@ -1223,10 +1269,10 @@
             </w:r>
             <w:r>
               <w:rPr>
-                <w:rFonts w:ascii="Arial" w:hAnsi="Arial" w:eastAsia="Arial" w:cs="Arial"/>
-                <w:b w:val="1"/>
-                <w:bCs w:val="1"/>
-                <w:color w:val="000000" w:themeColor="text1" w:themeTint="FF" w:themeShade="FF"/>
+                <w:rFonts w:ascii="Arial" w:eastAsia="Arial" w:hAnsi="Arial" w:cs="Arial"/>
+                <w:b/>
+                <w:bCs/>
+                <w:color w:val="000000" w:themeColor="text1"/>
                 <w:sz w:val="28"/>
                 <w:szCs w:val="28"/>
               </w:rPr>
@@ -1234,8 +1280,8 @@
             </w:r>
             <w:r>
               <w:rPr>
-                <w:rFonts w:ascii="Arial" w:hAnsi="Arial" w:eastAsia="Arial" w:cs="Arial"/>
-                <w:color w:val="000000" w:themeColor="text1" w:themeTint="FF" w:themeShade="FF"/>
+                <w:rFonts w:ascii="Arial" w:eastAsia="Arial" w:hAnsi="Arial" w:cs="Arial"/>
+                <w:color w:val="000000" w:themeColor="text1"/>
                 <w:sz w:val="28"/>
                 <w:szCs w:val="28"/>
               </w:rPr>
@@ -1243,8 +1289,8 @@
             </w:r>
             <w:r>
               <w:rPr>
-                <w:rFonts w:ascii="Arial" w:hAnsi="Arial" w:eastAsia="Arial" w:cs="Arial"/>
-                <w:color w:val="000000" w:themeColor="text1" w:themeTint="FF" w:themeShade="FF"/>
+                <w:rFonts w:ascii="Arial" w:eastAsia="Arial" w:hAnsi="Arial" w:cs="Arial"/>
+                <w:color w:val="000000" w:themeColor="text1"/>
                 <w:sz w:val="28"/>
                 <w:szCs w:val="28"/>
               </w:rPr>
@@ -1255,109 +1301,92 @@
         <w:tc>
           <w:tcPr>
             <w:tcW w:w="4680" w:type="dxa"/>
-            <w:tcMar/>
           </w:tcPr>
           <w:p>
             <w:pPr>
               <w:rPr>
-                <w:rFonts w:ascii="Arial" w:hAnsi="Arial" w:eastAsia="Arial" w:cs="Arial"/>
+                <w:rFonts w:ascii="Arial" w:eastAsia="Arial" w:hAnsi="Arial" w:cs="Arial"/>
                 <w:sz w:val="28"/>
                 <w:szCs w:val="28"/>
               </w:rPr>
             </w:pPr>
             <w:r>
               <w:rPr>
-                <w:rFonts w:ascii="Arial" w:hAnsi="Arial" w:eastAsia="Arial" w:cs="Arial"/>
-                <w:sz w:val="28"/>
-                <w:szCs w:val="28"/>
-              </w:rPr>
-              <w:t>Choose which</w:t>
-            </w:r>
-            <w:r>
-              <w:rPr>
-                <w:rFonts w:ascii="Arial" w:hAnsi="Arial" w:eastAsia="Arial" w:cs="Arial"/>
-                <w:sz w:val="28"/>
-                <w:szCs w:val="28"/>
-              </w:rPr>
-              <w:t xml:space="preserve"> </w:t>
-            </w:r>
-            <w:r>
-              <w:rPr>
-                <w:rFonts w:ascii="Arial" w:hAnsi="Arial" w:eastAsia="Arial" w:cs="Arial"/>
-                <w:sz w:val="28"/>
-                <w:szCs w:val="28"/>
-              </w:rPr>
-              <w:t xml:space="preserve">storytelling </w:t>
-            </w:r>
-            <w:r>
-              <w:rPr>
-                <w:rFonts w:ascii="Arial" w:hAnsi="Arial" w:eastAsia="Arial" w:cs="Arial"/>
-                <w:sz w:val="28"/>
-                <w:szCs w:val="28"/>
-              </w:rPr>
-              <w:t>element</w:t>
-            </w:r>
-            <w:r>
-              <w:rPr>
-                <w:rFonts w:ascii="Arial" w:hAnsi="Arial" w:eastAsia="Arial" w:cs="Arial"/>
-                <w:sz w:val="28"/>
-                <w:szCs w:val="28"/>
-              </w:rPr>
-              <w:t xml:space="preserve"> </w:t>
-            </w:r>
-            <w:r>
-              <w:rPr>
-                <w:rFonts w:ascii="Arial" w:hAnsi="Arial" w:eastAsia="Arial" w:cs="Arial"/>
-                <w:sz w:val="28"/>
-                <w:szCs w:val="28"/>
-              </w:rPr>
-              <w:t>f</w:t>
-            </w:r>
-            <w:r>
-              <w:rPr>
-                <w:rFonts w:ascii="Arial" w:hAnsi="Arial" w:eastAsia="Arial" w:cs="Arial"/>
-                <w:sz w:val="28"/>
-                <w:szCs w:val="28"/>
-              </w:rPr>
-              <w:t>rom the reading is the best f</w:t>
-            </w:r>
-            <w:r>
-              <w:rPr>
-                <w:rFonts w:ascii="Arial" w:hAnsi="Arial" w:eastAsia="Arial" w:cs="Arial"/>
-                <w:sz w:val="28"/>
-                <w:szCs w:val="28"/>
-              </w:rPr>
-              <w:t xml:space="preserve">or </w:t>
-            </w:r>
-            <w:r>
-              <w:rPr>
-                <w:rFonts w:ascii="Arial" w:hAnsi="Arial" w:eastAsia="Arial" w:cs="Arial"/>
-                <w:sz w:val="28"/>
-                <w:szCs w:val="28"/>
-              </w:rPr>
-              <w:t xml:space="preserve">your </w:t>
-            </w:r>
-            <w:r>
-              <w:rPr>
-                <w:rFonts w:ascii="Arial" w:hAnsi="Arial" w:eastAsia="Arial" w:cs="Arial"/>
-                <w:sz w:val="28"/>
-                <w:szCs w:val="28"/>
-              </w:rPr>
-              <w:t xml:space="preserve">presentation </w:t>
-            </w:r>
-            <w:r>
-              <w:rPr>
-                <w:rFonts w:ascii="Arial" w:hAnsi="Arial" w:eastAsia="Arial" w:cs="Arial"/>
-                <w:sz w:val="28"/>
-                <w:szCs w:val="28"/>
-              </w:rPr>
-              <w:t xml:space="preserve">and why. </w:t>
+                <w:rFonts w:ascii="Arial" w:eastAsia="Arial" w:hAnsi="Arial" w:cs="Arial"/>
+                <w:sz w:val="28"/>
+                <w:szCs w:val="28"/>
+              </w:rPr>
+              <w:t xml:space="preserve">The storytelling element in my presentation </w:t>
+            </w:r>
+            <w:r>
+              <w:rPr>
+                <w:rFonts w:ascii="Arial" w:eastAsia="Arial" w:hAnsi="Arial" w:cs="Arial"/>
+                <w:sz w:val="28"/>
+                <w:szCs w:val="28"/>
+              </w:rPr>
+              <w:t>will be</w:t>
+            </w:r>
+            <w:r>
+              <w:rPr>
+                <w:rFonts w:ascii="Arial" w:eastAsia="Arial" w:hAnsi="Arial" w:cs="Arial"/>
+                <w:sz w:val="28"/>
+                <w:szCs w:val="28"/>
+              </w:rPr>
+              <w:t xml:space="preserve"> data visualization. Data is such an important part of the decision</w:t>
+            </w:r>
+            <w:r>
+              <w:rPr>
+                <w:rFonts w:ascii="Arial" w:eastAsia="Arial" w:hAnsi="Arial" w:cs="Arial"/>
+                <w:sz w:val="28"/>
+                <w:szCs w:val="28"/>
+              </w:rPr>
+              <w:t>-</w:t>
+            </w:r>
+            <w:r>
+              <w:rPr>
+                <w:rFonts w:ascii="Arial" w:eastAsia="Arial" w:hAnsi="Arial" w:cs="Arial"/>
+                <w:sz w:val="28"/>
+                <w:szCs w:val="28"/>
+              </w:rPr>
+              <w:t>making process in modern baseball. Decision</w:t>
+            </w:r>
+            <w:r>
+              <w:rPr>
+                <w:rFonts w:ascii="Arial" w:eastAsia="Arial" w:hAnsi="Arial" w:cs="Arial"/>
+                <w:sz w:val="28"/>
+                <w:szCs w:val="28"/>
+              </w:rPr>
+              <w:t>-makers have access to vast amounts of information</w:t>
+            </w:r>
+            <w:r>
+              <w:rPr>
+                <w:rFonts w:ascii="Arial" w:eastAsia="Arial" w:hAnsi="Arial" w:cs="Arial"/>
+                <w:sz w:val="28"/>
+                <w:szCs w:val="28"/>
+              </w:rPr>
+              <w:t xml:space="preserve">, and </w:t>
+            </w:r>
+            <w:r>
+              <w:rPr>
+                <w:rFonts w:ascii="Arial" w:eastAsia="Arial" w:hAnsi="Arial" w:cs="Arial"/>
+                <w:sz w:val="28"/>
+                <w:szCs w:val="28"/>
+              </w:rPr>
+              <w:t>the effectiveness and authority of data are</w:t>
+            </w:r>
+            <w:r>
+              <w:rPr>
+                <w:rFonts w:ascii="Arial" w:eastAsia="Arial" w:hAnsi="Arial" w:cs="Arial"/>
+                <w:sz w:val="28"/>
+                <w:szCs w:val="28"/>
+              </w:rPr>
+              <w:t xml:space="preserve"> well respected in the league.</w:t>
             </w:r>
           </w:p>
           <w:p>
             <w:pPr>
               <w:rPr>
-                <w:rFonts w:ascii="Arial" w:hAnsi="Arial" w:eastAsia="Arial" w:cs="Arial"/>
+                <w:rFonts w:ascii="Arial" w:eastAsia="Arial" w:hAnsi="Arial" w:cs="Arial"/>
                 <w:sz w:val="28"/>
                 <w:szCs w:val="28"/>
               </w:rPr>
@@ -1366,146 +1395,34 @@
           <w:p>
             <w:pPr>
               <w:rPr>
-                <w:rFonts w:ascii="Arial" w:hAnsi="Arial" w:eastAsia="Arial" w:cs="Arial"/>
+                <w:rFonts w:ascii="Arial" w:eastAsia="Arial" w:hAnsi="Arial" w:cs="Arial"/>
                 <w:sz w:val="28"/>
                 <w:szCs w:val="28"/>
               </w:rPr>
             </w:pPr>
             <w:r>
               <w:rPr>
-                <w:rFonts w:ascii="Arial" w:hAnsi="Arial" w:eastAsia="Arial" w:cs="Arial"/>
-                <w:sz w:val="28"/>
-                <w:szCs w:val="28"/>
-              </w:rPr>
-              <w:t xml:space="preserve">Describe how </w:t>
-            </w:r>
-            <w:r>
-              <w:rPr>
-                <w:rFonts w:ascii="Arial" w:hAnsi="Arial" w:eastAsia="Arial" w:cs="Arial"/>
-                <w:sz w:val="28"/>
-                <w:szCs w:val="28"/>
-              </w:rPr>
-              <w:t>t</w:t>
-            </w:r>
-            <w:r>
-              <w:rPr>
-                <w:rFonts w:ascii="Arial" w:hAnsi="Arial" w:eastAsia="Arial" w:cs="Arial"/>
-                <w:sz w:val="28"/>
-                <w:szCs w:val="28"/>
-              </w:rPr>
-              <w:t>ha</w:t>
-            </w:r>
-            <w:r>
-              <w:rPr>
-                <w:rFonts w:ascii="Arial" w:hAnsi="Arial" w:eastAsia="Arial" w:cs="Arial"/>
-                <w:sz w:val="28"/>
-                <w:szCs w:val="28"/>
-              </w:rPr>
-              <w:t xml:space="preserve">t </w:t>
-            </w:r>
-            <w:r>
-              <w:rPr>
-                <w:rFonts w:ascii="Arial" w:hAnsi="Arial" w:eastAsia="Arial" w:cs="Arial"/>
-                <w:sz w:val="28"/>
-                <w:szCs w:val="28"/>
-              </w:rPr>
-              <w:t>element</w:t>
-            </w:r>
-            <w:r>
-              <w:rPr>
-                <w:rFonts w:ascii="Arial" w:hAnsi="Arial" w:eastAsia="Arial" w:cs="Arial"/>
-                <w:sz w:val="28"/>
-                <w:szCs w:val="28"/>
-              </w:rPr>
-              <w:t xml:space="preserve"> </w:t>
-            </w:r>
-            <w:r>
-              <w:rPr>
-                <w:rFonts w:ascii="Arial" w:hAnsi="Arial" w:eastAsia="Arial" w:cs="Arial"/>
-                <w:sz w:val="28"/>
-                <w:szCs w:val="28"/>
-              </w:rPr>
-              <w:t>will</w:t>
-            </w:r>
-            <w:r>
-              <w:rPr>
-                <w:rFonts w:ascii="Arial" w:hAnsi="Arial" w:eastAsia="Arial" w:cs="Arial"/>
-                <w:sz w:val="28"/>
-                <w:szCs w:val="28"/>
-              </w:rPr>
-              <w:t xml:space="preserve"> motivate</w:t>
-            </w:r>
-            <w:r>
-              <w:rPr>
-                <w:rFonts w:ascii="Arial" w:hAnsi="Arial" w:eastAsia="Arial" w:cs="Arial"/>
-                <w:sz w:val="28"/>
-                <w:szCs w:val="28"/>
-              </w:rPr>
-              <w:t xml:space="preserve">, </w:t>
-            </w:r>
-            <w:r>
-              <w:rPr>
-                <w:rFonts w:ascii="Arial" w:hAnsi="Arial" w:eastAsia="Arial" w:cs="Arial"/>
-                <w:sz w:val="28"/>
-                <w:szCs w:val="28"/>
-              </w:rPr>
-              <w:t>inform</w:t>
-            </w:r>
-            <w:r>
-              <w:rPr>
-                <w:rFonts w:ascii="Arial" w:hAnsi="Arial" w:eastAsia="Arial" w:cs="Arial"/>
-                <w:sz w:val="28"/>
-                <w:szCs w:val="28"/>
-              </w:rPr>
-              <w:t>,</w:t>
-            </w:r>
-            <w:r>
-              <w:rPr>
-                <w:rFonts w:ascii="Arial" w:hAnsi="Arial" w:eastAsia="Arial" w:cs="Arial"/>
-                <w:sz w:val="28"/>
-                <w:szCs w:val="28"/>
-              </w:rPr>
-              <w:t xml:space="preserve"> or</w:t>
-            </w:r>
-            <w:r>
-              <w:rPr>
-                <w:rFonts w:ascii="Arial" w:hAnsi="Arial" w:eastAsia="Arial" w:cs="Arial"/>
-                <w:sz w:val="28"/>
-                <w:szCs w:val="28"/>
-              </w:rPr>
-              <w:t xml:space="preserve"> </w:t>
-            </w:r>
-            <w:r>
-              <w:rPr>
-                <w:rFonts w:ascii="Arial" w:hAnsi="Arial" w:eastAsia="Arial" w:cs="Arial"/>
-                <w:sz w:val="28"/>
-                <w:szCs w:val="28"/>
-              </w:rPr>
-              <w:t>influence</w:t>
-            </w:r>
-            <w:r>
-              <w:rPr>
-                <w:rFonts w:ascii="Arial" w:hAnsi="Arial" w:eastAsia="Arial" w:cs="Arial"/>
-                <w:sz w:val="28"/>
-                <w:szCs w:val="28"/>
-              </w:rPr>
-              <w:t xml:space="preserve"> </w:t>
-            </w:r>
-            <w:r>
-              <w:rPr>
-                <w:rFonts w:ascii="Arial" w:hAnsi="Arial" w:eastAsia="Arial" w:cs="Arial"/>
-                <w:sz w:val="28"/>
-                <w:szCs w:val="28"/>
-              </w:rPr>
-              <w:t>your audience</w:t>
-            </w:r>
-            <w:r>
-              <w:rPr>
-                <w:rFonts w:ascii="Arial" w:hAnsi="Arial" w:eastAsia="Arial" w:cs="Arial"/>
-                <w:sz w:val="28"/>
-                <w:szCs w:val="28"/>
-              </w:rPr>
-              <w:t>.</w:t>
+                <w:rFonts w:ascii="Arial" w:eastAsia="Arial" w:hAnsi="Arial" w:cs="Arial"/>
+                <w:sz w:val="28"/>
+                <w:szCs w:val="28"/>
+              </w:rPr>
+              <w:t xml:space="preserve">The data visualizations </w:t>
+            </w:r>
+            <w:r>
+              <w:rPr>
+                <w:rFonts w:ascii="Arial" w:eastAsia="Arial" w:hAnsi="Arial" w:cs="Arial"/>
+                <w:sz w:val="28"/>
+                <w:szCs w:val="28"/>
+              </w:rPr>
+              <w:t>I will use will inform the audience about</w:t>
+            </w:r>
+            <w:r>
+              <w:rPr>
+                <w:rFonts w:ascii="Arial" w:eastAsia="Arial" w:hAnsi="Arial" w:cs="Arial"/>
+                <w:sz w:val="28"/>
+                <w:szCs w:val="28"/>
+              </w:rPr>
+              <w:t xml:space="preserve"> Torrey Lovullo's performance as a manager. This message will be clear and concise, which will influence them to hire him again in the upcoming season.</w:t>
             </w:r>
           </w:p>
         </w:tc>
@@ -1517,14 +1434,13 @@
         <w:tc>
           <w:tcPr>
             <w:tcW w:w="4680" w:type="dxa"/>
-            <w:tcMar/>
           </w:tcPr>
           <w:p>
             <w:pPr>
               <w:rPr>
-                <w:rFonts w:ascii="Arial" w:hAnsi="Arial" w:eastAsia="Arial" w:cs="Arial"/>
-                <w:b w:val="1"/>
-                <w:bCs w:val="1"/>
+                <w:rFonts w:ascii="Arial" w:eastAsia="Arial" w:hAnsi="Arial" w:cs="Arial"/>
+                <w:b/>
+                <w:bCs/>
                 <w:color w:val="000000" w:themeColor="text1"/>
                 <w:sz w:val="28"/>
                 <w:szCs w:val="28"/>
@@ -1532,10 +1448,10 @@
             </w:pPr>
             <w:r>
               <w:rPr>
-                <w:rFonts w:ascii="Arial" w:hAnsi="Arial" w:eastAsia="Arial" w:cs="Arial"/>
-                <w:b w:val="1"/>
-                <w:bCs w:val="1"/>
-                <w:color w:val="000000" w:themeColor="text1" w:themeTint="FF" w:themeShade="FF"/>
+                <w:rFonts w:ascii="Arial" w:eastAsia="Arial" w:hAnsi="Arial" w:cs="Arial"/>
+                <w:b/>
+                <w:bCs/>
+                <w:color w:val="000000" w:themeColor="text1"/>
                 <w:sz w:val="28"/>
                 <w:szCs w:val="28"/>
               </w:rPr>
@@ -1543,28 +1459,19 @@
             </w:r>
             <w:r>
               <w:rPr>
-                <w:rFonts w:ascii="Arial" w:hAnsi="Arial" w:eastAsia="Arial" w:cs="Arial"/>
-                <w:color w:val="000000" w:themeColor="text1" w:themeTint="FF" w:themeShade="FF"/>
-                <w:sz w:val="28"/>
-                <w:szCs w:val="28"/>
-              </w:rPr>
-              <w:t>Describe the visual design technique</w:t>
-            </w:r>
-            <w:r>
-              <w:rPr>
-                <w:rFonts w:ascii="Arial" w:hAnsi="Arial" w:eastAsia="Arial" w:cs="Arial"/>
-                <w:color w:val="000000" w:themeColor="text1" w:themeTint="FF" w:themeShade="FF"/>
-                <w:sz w:val="28"/>
-                <w:szCs w:val="28"/>
-              </w:rPr>
-              <w:t>s that will be used in the presentation.</w:t>
-            </w:r>
-            <w:r>
-              <w:rPr>
-                <w:rFonts w:ascii="Arial" w:hAnsi="Arial" w:eastAsia="Arial" w:cs="Arial"/>
-                <w:b w:val="1"/>
-                <w:bCs w:val="1"/>
-                <w:color w:val="000000" w:themeColor="text1" w:themeTint="FF" w:themeShade="FF"/>
+                <w:rFonts w:ascii="Arial" w:eastAsia="Arial" w:hAnsi="Arial" w:cs="Arial"/>
+                <w:color w:val="000000" w:themeColor="text1"/>
+                <w:sz w:val="28"/>
+                <w:szCs w:val="28"/>
+              </w:rPr>
+              <w:t>Describe the visual design techniques that will be used in the presentation.</w:t>
+            </w:r>
+            <w:r>
+              <w:rPr>
+                <w:rFonts w:ascii="Arial" w:eastAsia="Arial" w:hAnsi="Arial" w:cs="Arial"/>
+                <w:b/>
+                <w:bCs/>
+                <w:color w:val="000000" w:themeColor="text1"/>
                 <w:sz w:val="28"/>
                 <w:szCs w:val="28"/>
               </w:rPr>
@@ -1572,10 +1479,10 @@
             </w:r>
             <w:r>
               <w:rPr>
-                <w:rFonts w:ascii="Arial" w:hAnsi="Arial" w:eastAsia="Arial" w:cs="Arial"/>
-                <w:b w:val="1"/>
-                <w:bCs w:val="1"/>
-                <w:color w:val="000000" w:themeColor="text1" w:themeTint="FF" w:themeShade="FF"/>
+                <w:rFonts w:ascii="Arial" w:eastAsia="Arial" w:hAnsi="Arial" w:cs="Arial"/>
+                <w:b/>
+                <w:bCs/>
+                <w:color w:val="000000" w:themeColor="text1"/>
                 <w:sz w:val="28"/>
                 <w:szCs w:val="28"/>
               </w:rPr>
@@ -1583,10 +1490,10 @@
             </w:r>
             <w:r>
               <w:rPr>
-                <w:rFonts w:ascii="Arial" w:hAnsi="Arial" w:eastAsia="Arial" w:cs="Arial"/>
-                <w:b w:val="1"/>
-                <w:bCs w:val="1"/>
-                <w:color w:val="000000" w:themeColor="text1" w:themeTint="FF" w:themeShade="FF"/>
+                <w:rFonts w:ascii="Arial" w:eastAsia="Arial" w:hAnsi="Arial" w:cs="Arial"/>
+                <w:b/>
+                <w:bCs/>
+                <w:color w:val="000000" w:themeColor="text1"/>
                 <w:sz w:val="28"/>
                 <w:szCs w:val="28"/>
               </w:rPr>
@@ -1594,10 +1501,10 @@
             </w:r>
             <w:r>
               <w:rPr>
-                <w:rFonts w:ascii="Arial" w:hAnsi="Arial" w:eastAsia="Arial" w:cs="Arial"/>
-                <w:b w:val="1"/>
-                <w:bCs w:val="1"/>
-                <w:color w:val="000000" w:themeColor="text1" w:themeTint="FF" w:themeShade="FF"/>
+                <w:rFonts w:ascii="Arial" w:eastAsia="Arial" w:hAnsi="Arial" w:cs="Arial"/>
+                <w:b/>
+                <w:bCs/>
+                <w:color w:val="000000" w:themeColor="text1"/>
                 <w:sz w:val="28"/>
                 <w:szCs w:val="28"/>
               </w:rPr>
@@ -1605,10 +1512,10 @@
             </w:r>
             <w:r>
               <w:rPr>
-                <w:rFonts w:ascii="Arial" w:hAnsi="Arial" w:eastAsia="Arial" w:cs="Arial"/>
-                <w:b w:val="1"/>
-                <w:bCs w:val="1"/>
-                <w:color w:val="000000" w:themeColor="text1" w:themeTint="FF" w:themeShade="FF"/>
+                <w:rFonts w:ascii="Arial" w:eastAsia="Arial" w:hAnsi="Arial" w:cs="Arial"/>
+                <w:b/>
+                <w:bCs/>
+                <w:color w:val="000000" w:themeColor="text1"/>
                 <w:sz w:val="28"/>
                 <w:szCs w:val="28"/>
               </w:rPr>
@@ -1616,10 +1523,10 @@
             </w:r>
             <w:r>
               <w:rPr>
-                <w:rFonts w:ascii="Arial" w:hAnsi="Arial" w:eastAsia="Arial" w:cs="Arial"/>
-                <w:b w:val="1"/>
-                <w:bCs w:val="1"/>
-                <w:color w:val="000000" w:themeColor="text1" w:themeTint="FF" w:themeShade="FF"/>
+                <w:rFonts w:ascii="Arial" w:eastAsia="Arial" w:hAnsi="Arial" w:cs="Arial"/>
+                <w:b/>
+                <w:bCs/>
+                <w:color w:val="000000" w:themeColor="text1"/>
                 <w:sz w:val="28"/>
                 <w:szCs w:val="28"/>
               </w:rPr>
@@ -1627,10 +1534,10 @@
             </w:r>
             <w:r>
               <w:rPr>
-                <w:rFonts w:ascii="Arial" w:hAnsi="Arial" w:eastAsia="Arial" w:cs="Arial"/>
-                <w:b w:val="1"/>
-                <w:bCs w:val="1"/>
-                <w:color w:val="000000" w:themeColor="text1" w:themeTint="FF" w:themeShade="FF"/>
+                <w:rFonts w:ascii="Arial" w:eastAsia="Arial" w:hAnsi="Arial" w:cs="Arial"/>
+                <w:b/>
+                <w:bCs/>
+                <w:color w:val="000000" w:themeColor="text1"/>
                 <w:sz w:val="28"/>
                 <w:szCs w:val="28"/>
               </w:rPr>
@@ -1638,10 +1545,10 @@
             </w:r>
             <w:r>
               <w:rPr>
-                <w:rFonts w:ascii="Arial" w:hAnsi="Arial" w:eastAsia="Arial" w:cs="Arial"/>
-                <w:b w:val="1"/>
-                <w:bCs w:val="1"/>
-                <w:color w:val="000000" w:themeColor="text1" w:themeTint="FF" w:themeShade="FF"/>
+                <w:rFonts w:ascii="Arial" w:eastAsia="Arial" w:hAnsi="Arial" w:cs="Arial"/>
+                <w:b/>
+                <w:bCs/>
+                <w:color w:val="000000" w:themeColor="text1"/>
                 <w:sz w:val="28"/>
                 <w:szCs w:val="28"/>
               </w:rPr>
@@ -1651,7 +1558,7 @@
           <w:p>
             <w:pPr>
               <w:rPr>
-                <w:rFonts w:ascii="Arial" w:hAnsi="Arial" w:eastAsia="Arial" w:cs="Arial"/>
+                <w:rFonts w:ascii="Arial" w:eastAsia="Arial" w:hAnsi="Arial" w:cs="Arial"/>
                 <w:color w:val="000000" w:themeColor="text1"/>
                 <w:sz w:val="28"/>
                 <w:szCs w:val="28"/>
@@ -1659,26 +1566,17 @@
             </w:pPr>
             <w:r>
               <w:rPr>
-                <w:rFonts w:ascii="Arial" w:hAnsi="Arial" w:eastAsia="Arial" w:cs="Arial"/>
-                <w:color w:val="000000" w:themeColor="text1" w:themeTint="FF" w:themeShade="FF"/>
-                <w:sz w:val="28"/>
-                <w:szCs w:val="28"/>
-              </w:rPr>
-              <w:t>Then</w:t>
-            </w:r>
-            <w:r>
-              <w:rPr>
-                <w:rFonts w:ascii="Arial" w:hAnsi="Arial" w:eastAsia="Arial" w:cs="Arial"/>
-                <w:color w:val="000000" w:themeColor="text1" w:themeTint="FF" w:themeShade="FF"/>
-                <w:sz w:val="28"/>
-                <w:szCs w:val="28"/>
-              </w:rPr>
-              <w:t>, explain how the technique will motivate, inform, or influence the audience</w:t>
-            </w:r>
-            <w:r>
-              <w:rPr>
-                <w:rFonts w:ascii="Arial" w:hAnsi="Arial" w:eastAsia="Arial" w:cs="Arial"/>
-                <w:color w:val="000000" w:themeColor="text1" w:themeTint="FF" w:themeShade="FF"/>
+                <w:rFonts w:ascii="Arial" w:eastAsia="Arial" w:hAnsi="Arial" w:cs="Arial"/>
+                <w:color w:val="000000" w:themeColor="text1"/>
+                <w:sz w:val="28"/>
+                <w:szCs w:val="28"/>
+              </w:rPr>
+              <w:t>Then, explain how the technique will motivate, inform, or influence the audience</w:t>
+            </w:r>
+            <w:r>
+              <w:rPr>
+                <w:rFonts w:ascii="Arial" w:eastAsia="Arial" w:hAnsi="Arial" w:cs="Arial"/>
+                <w:color w:val="000000" w:themeColor="text1"/>
                 <w:sz w:val="28"/>
                 <w:szCs w:val="28"/>
               </w:rPr>
@@ -1686,10 +1584,10 @@
             </w:r>
             <w:r>
               <w:rPr>
-                <w:rFonts w:ascii="Arial" w:hAnsi="Arial" w:eastAsia="Arial" w:cs="Arial"/>
-                <w:b w:val="1"/>
-                <w:bCs w:val="1"/>
-                <w:color w:val="000000" w:themeColor="text1" w:themeTint="FF" w:themeShade="FF"/>
+                <w:rFonts w:ascii="Arial" w:eastAsia="Arial" w:hAnsi="Arial" w:cs="Arial"/>
+                <w:b/>
+                <w:bCs/>
+                <w:color w:val="000000" w:themeColor="text1"/>
                 <w:sz w:val="28"/>
                 <w:szCs w:val="28"/>
               </w:rPr>
@@ -1697,10 +1595,10 @@
             </w:r>
             <w:r>
               <w:rPr>
-                <w:rFonts w:ascii="Arial" w:hAnsi="Arial" w:eastAsia="Arial" w:cs="Arial"/>
-                <w:b w:val="1"/>
-                <w:bCs w:val="1"/>
-                <w:color w:val="000000" w:themeColor="text1" w:themeTint="FF" w:themeShade="FF"/>
+                <w:rFonts w:ascii="Arial" w:eastAsia="Arial" w:hAnsi="Arial" w:cs="Arial"/>
+                <w:b/>
+                <w:bCs/>
+                <w:color w:val="000000" w:themeColor="text1"/>
                 <w:sz w:val="28"/>
                 <w:szCs w:val="28"/>
               </w:rPr>
@@ -1708,10 +1606,10 @@
             </w:r>
             <w:r>
               <w:rPr>
-                <w:rFonts w:ascii="Arial" w:hAnsi="Arial" w:eastAsia="Arial" w:cs="Arial"/>
-                <w:b w:val="1"/>
-                <w:bCs w:val="1"/>
-                <w:color w:val="000000" w:themeColor="text1" w:themeTint="FF" w:themeShade="FF"/>
+                <w:rFonts w:ascii="Arial" w:eastAsia="Arial" w:hAnsi="Arial" w:cs="Arial"/>
+                <w:b/>
+                <w:bCs/>
+                <w:color w:val="000000" w:themeColor="text1"/>
                 <w:sz w:val="28"/>
                 <w:szCs w:val="28"/>
               </w:rPr>
@@ -1719,8 +1617,8 @@
             </w:r>
             <w:r>
               <w:rPr>
-                <w:rFonts w:ascii="Arial" w:hAnsi="Arial" w:eastAsia="Arial" w:cs="Arial"/>
-                <w:color w:val="000000" w:themeColor="text1" w:themeTint="FF" w:themeShade="FF"/>
+                <w:rFonts w:ascii="Arial" w:eastAsia="Arial" w:hAnsi="Arial" w:cs="Arial"/>
+                <w:color w:val="000000" w:themeColor="text1"/>
                 <w:sz w:val="28"/>
                 <w:szCs w:val="28"/>
               </w:rPr>
@@ -1731,127 +1629,70 @@
         <w:tc>
           <w:tcPr>
             <w:tcW w:w="4680" w:type="dxa"/>
-            <w:tcMar/>
           </w:tcPr>
           <w:p>
             <w:pPr>
               <w:rPr>
-                <w:rFonts w:ascii="Arial" w:hAnsi="Arial" w:eastAsia="Arial" w:cs="Arial"/>
+                <w:rFonts w:ascii="Arial" w:eastAsia="Arial" w:hAnsi="Arial" w:cs="Arial"/>
                 <w:sz w:val="28"/>
                 <w:szCs w:val="28"/>
               </w:rPr>
             </w:pPr>
             <w:r>
               <w:rPr>
-                <w:rFonts w:ascii="Arial" w:hAnsi="Arial" w:eastAsia="Arial" w:cs="Arial"/>
-                <w:sz w:val="28"/>
-                <w:szCs w:val="28"/>
-              </w:rPr>
-              <w:t xml:space="preserve">Select </w:t>
-            </w:r>
-            <w:r>
-              <w:rPr>
-                <w:rFonts w:ascii="Arial" w:hAnsi="Arial" w:eastAsia="Arial" w:cs="Arial"/>
-                <w:sz w:val="28"/>
-                <w:szCs w:val="28"/>
-              </w:rPr>
-              <w:t xml:space="preserve">a </w:t>
-            </w:r>
-            <w:r>
-              <w:rPr>
-                <w:rFonts w:ascii="Arial" w:hAnsi="Arial" w:eastAsia="Arial" w:cs="Arial"/>
-                <w:sz w:val="28"/>
-                <w:szCs w:val="28"/>
-              </w:rPr>
-              <w:t xml:space="preserve">visual design </w:t>
-            </w:r>
-            <w:r>
-              <w:rPr>
-                <w:rFonts w:ascii="Arial" w:hAnsi="Arial" w:eastAsia="Arial" w:cs="Arial"/>
-                <w:sz w:val="28"/>
-                <w:szCs w:val="28"/>
-              </w:rPr>
-              <w:t>strategy</w:t>
-            </w:r>
-            <w:r>
-              <w:rPr>
-                <w:rFonts w:ascii="Arial" w:hAnsi="Arial" w:eastAsia="Arial" w:cs="Arial"/>
-                <w:sz w:val="28"/>
-                <w:szCs w:val="28"/>
-              </w:rPr>
-              <w:t xml:space="preserve"> or strategies from the reading a</w:t>
-            </w:r>
-            <w:r>
-              <w:rPr>
-                <w:rFonts w:ascii="Arial" w:hAnsi="Arial" w:eastAsia="Arial" w:cs="Arial"/>
-                <w:sz w:val="28"/>
-                <w:szCs w:val="28"/>
-              </w:rPr>
-              <w:t xml:space="preserve">nd </w:t>
-            </w:r>
-            <w:r>
-              <w:rPr>
-                <w:rFonts w:ascii="Arial" w:hAnsi="Arial" w:eastAsia="Arial" w:cs="Arial"/>
-                <w:sz w:val="28"/>
-                <w:szCs w:val="28"/>
-              </w:rPr>
-              <w:t xml:space="preserve">describe </w:t>
-            </w:r>
-            <w:r>
-              <w:rPr>
-                <w:rFonts w:ascii="Arial" w:hAnsi="Arial" w:eastAsia="Arial" w:cs="Arial"/>
-                <w:sz w:val="28"/>
-                <w:szCs w:val="28"/>
-              </w:rPr>
-              <w:t xml:space="preserve">how </w:t>
-            </w:r>
-            <w:r>
-              <w:rPr>
-                <w:rFonts w:ascii="Arial" w:hAnsi="Arial" w:eastAsia="Arial" w:cs="Arial"/>
-                <w:sz w:val="28"/>
-                <w:szCs w:val="28"/>
-              </w:rPr>
-              <w:t>what you’ve chosen will</w:t>
-            </w:r>
-            <w:r>
-              <w:rPr>
-                <w:rFonts w:ascii="Arial" w:hAnsi="Arial" w:eastAsia="Arial" w:cs="Arial"/>
-                <w:sz w:val="28"/>
-                <w:szCs w:val="28"/>
-              </w:rPr>
-              <w:t xml:space="preserve"> either inform, motivat</w:t>
-            </w:r>
-            <w:r>
-              <w:rPr>
-                <w:rFonts w:ascii="Arial" w:hAnsi="Arial" w:eastAsia="Arial" w:cs="Arial"/>
-                <w:sz w:val="28"/>
-                <w:szCs w:val="28"/>
-              </w:rPr>
-              <w:t>e</w:t>
-            </w:r>
-            <w:r>
-              <w:rPr>
-                <w:rFonts w:ascii="Arial" w:hAnsi="Arial" w:eastAsia="Arial" w:cs="Arial"/>
-                <w:sz w:val="28"/>
-                <w:szCs w:val="28"/>
-              </w:rPr>
-              <w:t xml:space="preserve"> or influenc</w:t>
-            </w:r>
-            <w:r>
-              <w:rPr>
-                <w:rFonts w:ascii="Arial" w:hAnsi="Arial" w:eastAsia="Arial" w:cs="Arial"/>
-                <w:sz w:val="28"/>
-                <w:szCs w:val="28"/>
-              </w:rPr>
-              <w:t>e</w:t>
-            </w:r>
-            <w:r>
-              <w:rPr>
-                <w:rFonts w:ascii="Arial" w:hAnsi="Arial" w:eastAsia="Arial" w:cs="Arial"/>
-                <w:sz w:val="28"/>
-                <w:szCs w:val="28"/>
-              </w:rPr>
-              <w:t>.</w:t>
+                <w:rFonts w:ascii="Arial" w:eastAsia="Arial" w:hAnsi="Arial" w:cs="Arial"/>
+                <w:sz w:val="28"/>
+                <w:szCs w:val="28"/>
+              </w:rPr>
+              <w:t xml:space="preserve">To keep things simple for the audience, I will </w:t>
+            </w:r>
+            <w:r>
+              <w:rPr>
+                <w:rFonts w:ascii="Arial" w:eastAsia="Arial" w:hAnsi="Arial" w:cs="Arial"/>
+                <w:sz w:val="28"/>
+                <w:szCs w:val="28"/>
+              </w:rPr>
+              <w:t>use a clean, simple format</w:t>
+            </w:r>
+            <w:r>
+              <w:rPr>
+                <w:rFonts w:ascii="Arial" w:eastAsia="Arial" w:hAnsi="Arial" w:cs="Arial"/>
+                <w:sz w:val="28"/>
+                <w:szCs w:val="28"/>
+              </w:rPr>
+              <w:t xml:space="preserve">. I can also highlight the areas of the data visualization related to Torrey Lovullo and the Diamondbacks. This will help the data stand out </w:t>
+            </w:r>
+            <w:r>
+              <w:rPr>
+                <w:rFonts w:ascii="Arial" w:eastAsia="Arial" w:hAnsi="Arial" w:cs="Arial"/>
+                <w:sz w:val="28"/>
+                <w:szCs w:val="28"/>
+              </w:rPr>
+              <w:t>visually and</w:t>
+            </w:r>
+            <w:r>
+              <w:rPr>
+                <w:rFonts w:ascii="Arial" w:eastAsia="Arial" w:hAnsi="Arial" w:cs="Arial"/>
+                <w:sz w:val="28"/>
+                <w:szCs w:val="28"/>
+              </w:rPr>
+              <w:t xml:space="preserve"> influence their perception of how their performance stands out in the context as well. I will also include images to pair with my narration</w:t>
+            </w:r>
+            <w:r>
+              <w:rPr>
+                <w:rFonts w:ascii="Arial" w:eastAsia="Arial" w:hAnsi="Arial" w:cs="Arial"/>
+                <w:sz w:val="28"/>
+                <w:szCs w:val="28"/>
+              </w:rPr>
+              <w:t>, keeping the reading level low and making</w:t>
+            </w:r>
+            <w:r>
+              <w:rPr>
+                <w:rFonts w:ascii="Arial" w:eastAsia="Arial" w:hAnsi="Arial" w:cs="Arial"/>
+                <w:sz w:val="28"/>
+                <w:szCs w:val="28"/>
+              </w:rPr>
+              <w:t xml:space="preserve"> it easy to follow.</w:t>
             </w:r>
           </w:p>
         </w:tc>
@@ -1865,13 +1706,12 @@
             <w:tcW w:w="9360" w:type="dxa"/>
             <w:gridSpan w:val="2"/>
             <w:shd w:val="clear" w:color="auto" w:fill="FFF2CC" w:themeFill="accent4" w:themeFillTint="33"/>
-            <w:tcMar/>
           </w:tcPr>
           <w:p>
             <w:pPr>
               <w:jc w:val="center"/>
               <w:rPr>
-                <w:rFonts w:ascii="Arial" w:hAnsi="Arial" w:eastAsia="Arial" w:cs="Arial"/>
+                <w:rFonts w:ascii="Arial" w:eastAsia="Arial" w:hAnsi="Arial" w:cs="Arial"/>
                 <w:b/>
                 <w:bCs/>
                 <w:sz w:val="28"/>
@@ -1880,18 +1720,17 @@
             </w:pPr>
             <w:r>
               <w:rPr>
-                <w:rFonts w:ascii="Arial" w:hAnsi="Arial" w:eastAsia="Arial" w:cs="Arial"/>
-                <w:b/>
-                <w:bCs/>
-                <w:sz w:val="28"/>
-                <w:szCs w:val="28"/>
-              </w:rPr>
-              <w:lastRenderedPageBreak/>
+                <w:rFonts w:ascii="Arial" w:eastAsia="Arial" w:hAnsi="Arial" w:cs="Arial"/>
+                <w:b/>
+                <w:bCs/>
+                <w:sz w:val="28"/>
+                <w:szCs w:val="28"/>
+              </w:rPr>
               <w:t xml:space="preserve">Instructions for </w:t>
             </w:r>
             <w:r>
               <w:rPr>
-                <w:rFonts w:ascii="Arial" w:hAnsi="Arial" w:eastAsia="Arial" w:cs="Arial"/>
+                <w:rFonts w:ascii="Arial" w:eastAsia="Arial" w:hAnsi="Arial" w:cs="Arial"/>
                 <w:b/>
                 <w:bCs/>
                 <w:sz w:val="28"/>
@@ -1901,7 +1740,7 @@
             </w:r>
             <w:r>
               <w:rPr>
-                <w:rFonts w:ascii="Arial" w:hAnsi="Arial" w:eastAsia="Arial" w:cs="Arial"/>
+                <w:rFonts w:ascii="Arial" w:eastAsia="Arial" w:hAnsi="Arial" w:cs="Arial"/>
                 <w:b/>
                 <w:bCs/>
                 <w:sz w:val="28"/>
@@ -1911,7 +1750,7 @@
             </w:r>
             <w:r>
               <w:rPr>
-                <w:rFonts w:ascii="Arial" w:hAnsi="Arial" w:eastAsia="Arial" w:cs="Arial"/>
+                <w:rFonts w:ascii="Arial" w:eastAsia="Arial" w:hAnsi="Arial" w:cs="Arial"/>
                 <w:b/>
                 <w:bCs/>
                 <w:sz w:val="28"/>
@@ -1926,7 +1765,7 @@
             </w:pPr>
             <w:r>
               <w:rPr>
-                <w:rFonts w:ascii="Arial" w:hAnsi="Arial" w:eastAsia="Arial" w:cs="Arial"/>
+                <w:rFonts w:ascii="Arial" w:eastAsia="Arial" w:hAnsi="Arial" w:cs="Arial"/>
                 <w:color w:val="333333"/>
                 <w:sz w:val="28"/>
                 <w:szCs w:val="28"/>
@@ -1935,7 +1774,7 @@
             </w:r>
             <w:r>
               <w:rPr>
-                <w:rFonts w:ascii="Arial" w:hAnsi="Arial" w:eastAsia="Arial" w:cs="Arial"/>
+                <w:rFonts w:ascii="Arial" w:eastAsia="Arial" w:hAnsi="Arial" w:cs="Arial"/>
                 <w:color w:val="000000" w:themeColor="text1"/>
                 <w:sz w:val="28"/>
                 <w:szCs w:val="28"/>
@@ -1944,7 +1783,7 @@
             </w:r>
             <w:r>
               <w:rPr>
-                <w:rFonts w:ascii="Arial" w:hAnsi="Arial" w:eastAsia="Arial" w:cs="Arial"/>
+                <w:rFonts w:ascii="Arial" w:eastAsia="Arial" w:hAnsi="Arial" w:cs="Arial"/>
                 <w:sz w:val="28"/>
                 <w:szCs w:val="28"/>
               </w:rPr>
@@ -1952,7 +1791,7 @@
             </w:r>
             <w:r>
               <w:rPr>
-                <w:rFonts w:ascii="Arial" w:hAnsi="Arial" w:eastAsia="Arial" w:cs="Arial"/>
+                <w:rFonts w:ascii="Arial" w:eastAsia="Arial" w:hAnsi="Arial" w:cs="Arial"/>
                 <w:color w:val="333333"/>
                 <w:sz w:val="28"/>
                 <w:szCs w:val="28"/>
@@ -1961,7 +1800,7 @@
             </w:r>
             <w:r>
               <w:rPr>
-                <w:rFonts w:ascii="Arial" w:hAnsi="Arial" w:eastAsia="Arial" w:cs="Arial"/>
+                <w:rFonts w:ascii="Arial" w:eastAsia="Arial" w:hAnsi="Arial" w:cs="Arial"/>
                 <w:sz w:val="28"/>
                 <w:szCs w:val="28"/>
               </w:rPr>
@@ -1973,7 +1812,7 @@
               <w:ind w:right="-30"/>
               <w:rPr>
                 <w:rStyle w:val="eop"/>
-                <w:rFonts w:ascii="Arial" w:hAnsi="Arial" w:eastAsia="Arial" w:cs="Arial"/>
+                <w:rFonts w:ascii="Arial" w:eastAsia="Arial" w:hAnsi="Arial" w:cs="Arial"/>
                 <w:color w:val="000000" w:themeColor="text1"/>
                 <w:sz w:val="28"/>
                 <w:szCs w:val="28"/>
@@ -1984,7 +1823,7 @@
             <w:r>
               <w:rPr>
                 <w:rStyle w:val="normaltextrun"/>
-                <w:rFonts w:ascii="Arial" w:hAnsi="Arial" w:eastAsia="Arial" w:cs="Arial"/>
+                <w:rFonts w:ascii="Arial" w:eastAsia="Arial" w:hAnsi="Arial" w:cs="Arial"/>
                 <w:i/>
                 <w:iCs/>
                 <w:color w:val="000000" w:themeColor="text1"/>
@@ -1996,7 +1835,7 @@
             </w:r>
             <w:r>
               <w:rPr>
-                <w:rFonts w:ascii="Arial" w:hAnsi="Arial" w:eastAsia="Arial" w:cs="Arial"/>
+                <w:rFonts w:ascii="Arial" w:eastAsia="Arial" w:hAnsi="Arial" w:cs="Arial"/>
                 <w:color w:val="000000" w:themeColor="text1"/>
                 <w:sz w:val="28"/>
                 <w:szCs w:val="28"/>
@@ -2009,7 +1848,7 @@
             </w:r>
             <w:r>
               <w:rPr>
-                <w:rFonts w:ascii="Arial" w:hAnsi="Arial" w:eastAsia="Arial" w:cs="Arial"/>
+                <w:rFonts w:ascii="Arial" w:eastAsia="Arial" w:hAnsi="Arial" w:cs="Arial"/>
                 <w:color w:val="000000" w:themeColor="text1"/>
                 <w:sz w:val="28"/>
                 <w:szCs w:val="28"/>
@@ -2018,7 +1857,7 @@
             </w:r>
             <w:r>
               <w:rPr>
-                <w:rFonts w:ascii="Arial" w:hAnsi="Arial" w:eastAsia="Arial" w:cs="Arial"/>
+                <w:rFonts w:ascii="Arial" w:eastAsia="Arial" w:hAnsi="Arial" w:cs="Arial"/>
                 <w:color w:val="000000" w:themeColor="text1"/>
                 <w:sz w:val="28"/>
                 <w:szCs w:val="28"/>
@@ -2027,12 +1866,22 @@
             </w:r>
             <w:r>
               <w:rPr>
-                <w:rFonts w:ascii="Arial" w:hAnsi="Arial" w:eastAsia="Arial" w:cs="Arial"/>
-                <w:color w:val="000000" w:themeColor="text1"/>
-                <w:sz w:val="28"/>
-                <w:szCs w:val="28"/>
-              </w:rPr>
-              <w:t xml:space="preserve"> these: “Course material states” or “Course information explains.” Do not directly quote course materials; paraphrase instead.</w:t>
+                <w:rFonts w:ascii="Arial" w:eastAsia="Arial" w:hAnsi="Arial" w:cs="Arial"/>
+                <w:color w:val="000000" w:themeColor="text1"/>
+                <w:sz w:val="28"/>
+                <w:szCs w:val="28"/>
+              </w:rPr>
+              <w:t xml:space="preserve"> these: </w:t>
+            </w:r>
+            <w:r>
+              <w:rPr>
+                <w:rFonts w:ascii="Arial" w:eastAsia="Arial" w:hAnsi="Arial" w:cs="Arial"/>
+                <w:color w:val="000000" w:themeColor="text1"/>
+                <w:sz w:val="28"/>
+                <w:szCs w:val="28"/>
+              </w:rPr>
+              <w:lastRenderedPageBreak/>
+              <w:t>“Course material states” or “Course information explains.” Do not directly quote course materials; paraphrase instead.</w:t>
             </w:r>
           </w:p>
         </w:tc>
@@ -2046,14 +1895,13 @@
             <w:tcW w:w="9360" w:type="dxa"/>
             <w:gridSpan w:val="2"/>
             <w:shd w:val="clear" w:color="auto" w:fill="FFFFFF" w:themeFill="background1"/>
-            <w:tcMar/>
           </w:tcPr>
           <w:p>
             <w:pPr>
               <w:spacing w:line="259" w:lineRule="auto"/>
               <w:rPr>
                 <w:rStyle w:val="normaltextrun"/>
-                <w:rFonts w:ascii="Arial" w:hAnsi="Arial" w:eastAsia="Arial" w:cs="Arial"/>
+                <w:rFonts w:ascii="Arial" w:eastAsia="Arial" w:hAnsi="Arial" w:cs="Arial"/>
                 <w:color w:val="000000" w:themeColor="text1"/>
                 <w:sz w:val="28"/>
                 <w:szCs w:val="28"/>
@@ -2062,19 +1910,20 @@
             <w:r>
               <w:rPr>
                 <w:rStyle w:val="normaltextrun"/>
-                <w:rFonts w:ascii="Arial" w:hAnsi="Arial" w:eastAsia="Arial" w:cs="Arial"/>
-                <w:b/>
-                <w:bCs/>
-                <w:color w:val="000000" w:themeColor="text1"/>
-                <w:sz w:val="28"/>
-                <w:szCs w:val="28"/>
-              </w:rPr>
+                <w:rFonts w:ascii="Arial" w:eastAsia="Arial" w:hAnsi="Arial" w:cs="Arial"/>
+                <w:b/>
+                <w:bCs/>
+                <w:color w:val="000000" w:themeColor="text1"/>
+                <w:sz w:val="28"/>
+                <w:szCs w:val="28"/>
+              </w:rPr>
+              <w:lastRenderedPageBreak/>
               <w:t>WRITE REFERENCES HERE, IF APPLICABLE.</w:t>
             </w:r>
             <w:r>
               <w:rPr>
                 <w:rStyle w:val="normaltextrun"/>
-                <w:rFonts w:ascii="Arial" w:hAnsi="Arial" w:eastAsia="Arial" w:cs="Arial"/>
+                <w:rFonts w:ascii="Arial" w:eastAsia="Arial" w:hAnsi="Arial" w:cs="Arial"/>
                 <w:color w:val="000000" w:themeColor="text1"/>
                 <w:sz w:val="28"/>
                 <w:szCs w:val="28"/>
@@ -2087,7 +1936,7 @@
               <w:spacing w:line="259" w:lineRule="auto"/>
               <w:rPr>
                 <w:rStyle w:val="normaltextrun"/>
-                <w:rFonts w:ascii="Arial" w:hAnsi="Arial" w:eastAsia="Arial" w:cs="Arial"/>
+                <w:rFonts w:ascii="Arial" w:eastAsia="Arial" w:hAnsi="Arial" w:cs="Arial"/>
                 <w:color w:val="000000" w:themeColor="text1"/>
                 <w:sz w:val="28"/>
                 <w:szCs w:val="28"/>
@@ -2103,7 +1952,7 @@
       </w:pPr>
       <w:r>
         <w:rPr>
-          <w:rFonts w:ascii="Arial" w:hAnsi="Arial" w:eastAsia="Arial" w:cs="Arial"/>
+          <w:rFonts w:ascii="Arial" w:eastAsia="Arial" w:hAnsi="Arial" w:cs="Arial"/>
           <w:b/>
           <w:bCs/>
           <w:color w:val="000000" w:themeColor="text1"/>
@@ -2114,7 +1963,7 @@
       </w:r>
       <w:r>
         <w:rPr>
-          <w:rFonts w:ascii="Arial" w:hAnsi="Arial" w:eastAsia="Arial" w:cs="Arial"/>
+          <w:rFonts w:ascii="Arial" w:eastAsia="Arial" w:hAnsi="Arial" w:cs="Arial"/>
           <w:b/>
           <w:bCs/>
           <w:color w:val="000000" w:themeColor="text1"/>
@@ -2125,7 +1974,7 @@
       </w:r>
       <w:r>
         <w:rPr>
-          <w:rFonts w:ascii="Arial" w:hAnsi="Arial" w:eastAsia="Arial" w:cs="Arial"/>
+          <w:rFonts w:ascii="Arial" w:eastAsia="Arial" w:hAnsi="Arial" w:cs="Arial"/>
           <w:b/>
           <w:bCs/>
           <w:color w:val="000000" w:themeColor="text1"/>
@@ -2136,7 +1985,7 @@
       </w:r>
       <w:r>
         <w:rPr>
-          <w:rFonts w:ascii="Arial" w:hAnsi="Arial" w:eastAsia="Arial" w:cs="Arial"/>
+          <w:rFonts w:ascii="Arial" w:eastAsia="Arial" w:hAnsi="Arial" w:cs="Arial"/>
           <w:sz w:val="28"/>
           <w:szCs w:val="28"/>
         </w:rPr>
@@ -2147,7 +1996,7 @@
       <w:pPr>
         <w:rPr>
           <w:rStyle w:val="eop"/>
-          <w:rFonts w:ascii="Arial" w:hAnsi="Arial" w:eastAsia="Arial" w:cs="Arial"/>
+          <w:rFonts w:ascii="Arial" w:eastAsia="Arial" w:hAnsi="Arial" w:cs="Arial"/>
           <w:color w:val="000000" w:themeColor="text1"/>
           <w:sz w:val="28"/>
           <w:szCs w:val="28"/>
@@ -2157,14 +2006,14 @@
     <w:p>
       <w:pPr>
         <w:rPr>
-          <w:rFonts w:ascii="Arial" w:hAnsi="Arial" w:eastAsia="Arial" w:cs="Arial"/>
+          <w:rFonts w:ascii="Arial" w:eastAsia="Arial" w:hAnsi="Arial" w:cs="Arial"/>
           <w:sz w:val="28"/>
           <w:szCs w:val="28"/>
         </w:rPr>
       </w:pPr>
     </w:p>
     <w:sectPr>
-      <w:pgSz w:w="12240" w:h="15840" w:orient="portrait"/>
+      <w:pgSz w:w="12240" w:h="15840"/>
       <w:pgMar w:top="1440" w:right="1440" w:bottom="1440" w:left="1440" w:header="720" w:footer="720" w:gutter="0"/>
       <w:cols w:space="720"/>
       <w:docGrid w:linePitch="360"/>
@@ -2174,7 +2023,7 @@
 </file>
 
 <file path=word/endnotes.xml><?xml version="1.0" encoding="utf-8"?>
-<w:endnotes xmlns:wpc="http://schemas.microsoft.com/office/word/2010/wordprocessingCanvas" xmlns:cx="http://schemas.microsoft.com/office/drawing/2014/chartex" xmlns:cx1="http://schemas.microsoft.com/office/drawing/2015/9/8/chartex" xmlns:cx2="http://schemas.microsoft.com/office/drawing/2015/10/21/chartex" xmlns:cx3="http://schemas.microsoft.com/office/drawing/2016/5/9/chartex" xmlns:cx4="http://schemas.microsoft.com/office/drawing/2016/5/10/chartex" xmlns:cx5="http://schemas.microsoft.com/office/drawing/2016/5/11/chartex" xmlns:cx6="http://schemas.microsoft.com/office/drawing/2016/5/12/chartex" xmlns:cx7="http://schemas.microsoft.com/office/drawing/2016/5/13/chartex" xmlns:cx8="http://schemas.microsoft.com/office/drawing/2016/5/14/chartex" xmlns:mc="http://schemas.openxmlformats.org/markup-compatibility/2006" xmlns:aink="http://schemas.microsoft.com/office/drawing/2016/ink" xmlns:am3d="http://schemas.microsoft.com/office/drawing/2017/model3d" xmlns:o="urn:schemas-microsoft-com:office:office" xmlns:oel="http://schemas.microsoft.com/office/2019/extlst" xmlns:r="http://schemas.openxmlformats.org/officeDocument/2006/relationships" xmlns:m="http://schemas.openxmlformats.org/officeDocument/2006/math" xmlns:v="urn:schemas-microsoft-com:vml" xmlns:wp14="http://schemas.microsoft.com/office/word/2010/wordprocessingDrawing" xmlns:wp="http://schemas.openxmlformats.org/drawingml/2006/wordprocessingDrawing" xmlns:w10="urn:schemas-microsoft-com:office:word" xmlns:w="http://schemas.openxmlformats.org/wordprocessingml/2006/main" xmlns:w14="http://schemas.microsoft.com/office/word/2010/wordml" xmlns:w15="http://schemas.microsoft.com/office/word/2012/wordml" xmlns:w16cex="http://schemas.microsoft.com/office/word/2018/wordml/cex" xmlns:w16cid="http://schemas.microsoft.com/office/word/2016/wordml/cid" xmlns:w16="http://schemas.microsoft.com/office/word/2018/wordml" xmlns:w16du="http://schemas.microsoft.com/office/word/2023/wordml/word16du" xmlns:w16sdtdh="http://schemas.microsoft.com/office/word/2020/wordml/sdtdatahash" xmlns:w16sdtfl="http://schemas.microsoft.com/office/word/2024/wordml/sdtformatlock" xmlns:w16se="http://schemas.microsoft.com/office/word/2015/wordml/symex" xmlns:wpg="http://schemas.microsoft.com/office/word/2010/wordprocessingGroup" xmlns:wpi="http://schemas.microsoft.com/office/word/2010/wordprocessingInk" xmlns:wne="http://schemas.microsoft.com/office/word/2006/wordml" xmlns:wps="http://schemas.microsoft.com/office/word/2010/wordprocessingShape" mc:Ignorable="w14 w15 w16se w16cid w16 w16cex w16sdtdh w16sdtfl w16du wp14">
+<w:endnotes xmlns:wpc="http://schemas.microsoft.com/office/word/2010/wordprocessingCanvas" xmlns:cx="http://schemas.microsoft.com/office/drawing/2014/chartex" xmlns:cx1="http://schemas.microsoft.com/office/drawing/2015/9/8/chartex" xmlns:cx2="http://schemas.microsoft.com/office/drawing/2015/10/21/chartex" xmlns:cx3="http://schemas.microsoft.com/office/drawing/2016/5/9/chartex" xmlns:cx4="http://schemas.microsoft.com/office/drawing/2016/5/10/chartex" xmlns:cx5="http://schemas.microsoft.com/office/drawing/2016/5/11/chartex" xmlns:cx6="http://schemas.microsoft.com/office/drawing/2016/5/12/chartex" xmlns:cx7="http://schemas.microsoft.com/office/drawing/2016/5/13/chartex" xmlns:cx8="http://schemas.microsoft.com/office/drawing/2016/5/14/chartex" xmlns:mc="http://schemas.openxmlformats.org/markup-compatibility/2006" xmlns:m="http://schemas.openxmlformats.org/officeDocument/2006/math" xmlns:aink="http://schemas.microsoft.com/office/drawing/2016/ink" xmlns:am3d="http://schemas.microsoft.com/office/drawing/2017/model3d" xmlns:oel="http://schemas.microsoft.com/office/2019/extlst" xmlns:r="http://schemas.openxmlformats.org/officeDocument/2006/relationships" xmlns:wp14="http://schemas.microsoft.com/office/word/2010/wordprocessingDrawing" xmlns:wp="http://schemas.openxmlformats.org/drawingml/2006/wordprocessingDrawing" xmlns:wpg="http://schemas.microsoft.com/office/word/2010/wordprocessingGroup" xmlns:wpi="http://schemas.microsoft.com/office/word/2010/wordprocessingInk" xmlns:wps="http://schemas.microsoft.com/office/word/2010/wordprocessingShape" xmlns:o="urn:schemas-microsoft-com:office:office" xmlns:v="urn:schemas-microsoft-com:vml" xmlns:w10="urn:schemas-microsoft-com:office:word" xmlns:w="http://schemas.openxmlformats.org/wordprocessingml/2006/main" xmlns:w14="http://schemas.microsoft.com/office/word/2010/wordml" xmlns:w15="http://schemas.microsoft.com/office/word/2012/wordml" xmlns:w16cex="http://schemas.microsoft.com/office/word/2018/wordml/cex" xmlns:w16cid="http://schemas.microsoft.com/office/word/2016/wordml/cid" xmlns:w16="http://schemas.microsoft.com/office/word/2018/wordml" xmlns:w16sdtdh="http://schemas.microsoft.com/office/word/2020/wordml/sdtdatahash" xmlns:w16sdtfl="http://schemas.microsoft.com/office/word/2024/wordml/sdtformatlock" xmlns:w16se="http://schemas.microsoft.com/office/word/2015/wordml/symex" xmlns:w16du="http://schemas.microsoft.com/office/word/2023/wordml/word16du" xmlns:wne="http://schemas.microsoft.com/office/word/2006/wordml" mc:Ignorable="w14 w15 w16se w16cid w16 w16cex w16sdtdh w16sdtfl w16du wp14">
   <w:endnote w:type="separator" w:id="-1">
     <w:p>
       <w:pPr>
@@ -2199,7 +2048,7 @@
 </file>
 
 <file path=word/footnotes.xml><?xml version="1.0" encoding="utf-8"?>
-<w:footnotes xmlns:wpc="http://schemas.microsoft.com/office/word/2010/wordprocessingCanvas" xmlns:cx="http://schemas.microsoft.com/office/drawing/2014/chartex" xmlns:cx1="http://schemas.microsoft.com/office/drawing/2015/9/8/chartex" xmlns:cx2="http://schemas.microsoft.com/office/drawing/2015/10/21/chartex" xmlns:cx3="http://schemas.microsoft.com/office/drawing/2016/5/9/chartex" xmlns:cx4="http://schemas.microsoft.com/office/drawing/2016/5/10/chartex" xmlns:cx5="http://schemas.microsoft.com/office/drawing/2016/5/11/chartex" xmlns:cx6="http://schemas.microsoft.com/office/drawing/2016/5/12/chartex" xmlns:cx7="http://schemas.microsoft.com/office/drawing/2016/5/13/chartex" xmlns:cx8="http://schemas.microsoft.com/office/drawing/2016/5/14/chartex" xmlns:mc="http://schemas.openxmlformats.org/markup-compatibility/2006" xmlns:aink="http://schemas.microsoft.com/office/drawing/2016/ink" xmlns:am3d="http://schemas.microsoft.com/office/drawing/2017/model3d" xmlns:o="urn:schemas-microsoft-com:office:office" xmlns:oel="http://schemas.microsoft.com/office/2019/extlst" xmlns:r="http://schemas.openxmlformats.org/officeDocument/2006/relationships" xmlns:m="http://schemas.openxmlformats.org/officeDocument/2006/math" xmlns:v="urn:schemas-microsoft-com:vml" xmlns:wp14="http://schemas.microsoft.com/office/word/2010/wordprocessingDrawing" xmlns:wp="http://schemas.openxmlformats.org/drawingml/2006/wordprocessingDrawing" xmlns:w10="urn:schemas-microsoft-com:office:word" xmlns:w="http://schemas.openxmlformats.org/wordprocessingml/2006/main" xmlns:w14="http://schemas.microsoft.com/office/word/2010/wordml" xmlns:w15="http://schemas.microsoft.com/office/word/2012/wordml" xmlns:w16cex="http://schemas.microsoft.com/office/word/2018/wordml/cex" xmlns:w16cid="http://schemas.microsoft.com/office/word/2016/wordml/cid" xmlns:w16="http://schemas.microsoft.com/office/word/2018/wordml" xmlns:w16du="http://schemas.microsoft.com/office/word/2023/wordml/word16du" xmlns:w16sdtdh="http://schemas.microsoft.com/office/word/2020/wordml/sdtdatahash" xmlns:w16sdtfl="http://schemas.microsoft.com/office/word/2024/wordml/sdtformatlock" xmlns:w16se="http://schemas.microsoft.com/office/word/2015/wordml/symex" xmlns:wpg="http://schemas.microsoft.com/office/word/2010/wordprocessingGroup" xmlns:wpi="http://schemas.microsoft.com/office/word/2010/wordprocessingInk" xmlns:wne="http://schemas.microsoft.com/office/word/2006/wordml" xmlns:wps="http://schemas.microsoft.com/office/word/2010/wordprocessingShape" mc:Ignorable="w14 w15 w16se w16cid w16 w16cex w16sdtdh w16sdtfl w16du wp14">
+<w:footnotes xmlns:wpc="http://schemas.microsoft.com/office/word/2010/wordprocessingCanvas" xmlns:cx="http://schemas.microsoft.com/office/drawing/2014/chartex" xmlns:cx1="http://schemas.microsoft.com/office/drawing/2015/9/8/chartex" xmlns:cx2="http://schemas.microsoft.com/office/drawing/2015/10/21/chartex" xmlns:cx3="http://schemas.microsoft.com/office/drawing/2016/5/9/chartex" xmlns:cx4="http://schemas.microsoft.com/office/drawing/2016/5/10/chartex" xmlns:cx5="http://schemas.microsoft.com/office/drawing/2016/5/11/chartex" xmlns:cx6="http://schemas.microsoft.com/office/drawing/2016/5/12/chartex" xmlns:cx7="http://schemas.microsoft.com/office/drawing/2016/5/13/chartex" xmlns:cx8="http://schemas.microsoft.com/office/drawing/2016/5/14/chartex" xmlns:mc="http://schemas.openxmlformats.org/markup-compatibility/2006" xmlns:m="http://schemas.openxmlformats.org/officeDocument/2006/math" xmlns:aink="http://schemas.microsoft.com/office/drawing/2016/ink" xmlns:am3d="http://schemas.microsoft.com/office/drawing/2017/model3d" xmlns:oel="http://schemas.microsoft.com/office/2019/extlst" xmlns:r="http://schemas.openxmlformats.org/officeDocument/2006/relationships" xmlns:wp14="http://schemas.microsoft.com/office/word/2010/wordprocessingDrawing" xmlns:wp="http://schemas.openxmlformats.org/drawingml/2006/wordprocessingDrawing" xmlns:wpg="http://schemas.microsoft.com/office/word/2010/wordprocessingGroup" xmlns:wpi="http://schemas.microsoft.com/office/word/2010/wordprocessingInk" xmlns:wps="http://schemas.microsoft.com/office/word/2010/wordprocessingShape" xmlns:o="urn:schemas-microsoft-com:office:office" xmlns:v="urn:schemas-microsoft-com:vml" xmlns:w10="urn:schemas-microsoft-com:office:word" xmlns:w="http://schemas.openxmlformats.org/wordprocessingml/2006/main" xmlns:w14="http://schemas.microsoft.com/office/word/2010/wordml" xmlns:w15="http://schemas.microsoft.com/office/word/2012/wordml" xmlns:w16cex="http://schemas.microsoft.com/office/word/2018/wordml/cex" xmlns:w16cid="http://schemas.microsoft.com/office/word/2016/wordml/cid" xmlns:w16="http://schemas.microsoft.com/office/word/2018/wordml" xmlns:w16sdtdh="http://schemas.microsoft.com/office/word/2020/wordml/sdtdatahash" xmlns:w16sdtfl="http://schemas.microsoft.com/office/word/2024/wordml/sdtformatlock" xmlns:w16se="http://schemas.microsoft.com/office/word/2015/wordml/symex" xmlns:w16du="http://schemas.microsoft.com/office/word/2023/wordml/word16du" xmlns:wne="http://schemas.microsoft.com/office/word/2006/wordml" mc:Ignorable="w14 w15 w16se w16cid w16 w16cex w16sdtdh w16sdtfl w16du wp14">
   <w:footnote w:type="separator" w:id="-1">
     <w:p>
       <w:pPr>
@@ -2224,7 +2073,7 @@
 </file>
 
 <file path=word/numbering.xml><?xml version="1.0" encoding="utf-8"?>
-<w:numbering xmlns:wpc="http://schemas.microsoft.com/office/word/2010/wordprocessingCanvas" xmlns:cx="http://schemas.microsoft.com/office/drawing/2014/chartex" xmlns:cx1="http://schemas.microsoft.com/office/drawing/2015/9/8/chartex" xmlns:cx2="http://schemas.microsoft.com/office/drawing/2015/10/21/chartex" xmlns:cx3="http://schemas.microsoft.com/office/drawing/2016/5/9/chartex" xmlns:cx4="http://schemas.microsoft.com/office/drawing/2016/5/10/chartex" xmlns:cx5="http://schemas.microsoft.com/office/drawing/2016/5/11/chartex" xmlns:cx6="http://schemas.microsoft.com/office/drawing/2016/5/12/chartex" xmlns:cx7="http://schemas.microsoft.com/office/drawing/2016/5/13/chartex" xmlns:cx8="http://schemas.microsoft.com/office/drawing/2016/5/14/chartex" xmlns:mc="http://schemas.openxmlformats.org/markup-compatibility/2006" xmlns:aink="http://schemas.microsoft.com/office/drawing/2016/ink" xmlns:am3d="http://schemas.microsoft.com/office/drawing/2017/model3d" xmlns:o="urn:schemas-microsoft-com:office:office" xmlns:oel="http://schemas.microsoft.com/office/2019/extlst" xmlns:r="http://schemas.openxmlformats.org/officeDocument/2006/relationships" xmlns:m="http://schemas.openxmlformats.org/officeDocument/2006/math" xmlns:v="urn:schemas-microsoft-com:vml" xmlns:wp14="http://schemas.microsoft.com/office/word/2010/wordprocessingDrawing" xmlns:wp="http://schemas.openxmlformats.org/drawingml/2006/wordprocessingDrawing" xmlns:w10="urn:schemas-microsoft-com:office:word" xmlns:w="http://schemas.openxmlformats.org/wordprocessingml/2006/main" xmlns:w14="http://schemas.microsoft.com/office/word/2010/wordml" xmlns:w15="http://schemas.microsoft.com/office/word/2012/wordml" xmlns:w16cex="http://schemas.microsoft.com/office/word/2018/wordml/cex" xmlns:w16cid="http://schemas.microsoft.com/office/word/2016/wordml/cid" xmlns:w16="http://schemas.microsoft.com/office/word/2018/wordml" xmlns:w16du="http://schemas.microsoft.com/office/word/2023/wordml/word16du" xmlns:w16sdtdh="http://schemas.microsoft.com/office/word/2020/wordml/sdtdatahash" xmlns:w16sdtfl="http://schemas.microsoft.com/office/word/2024/wordml/sdtformatlock" xmlns:w16se="http://schemas.microsoft.com/office/word/2015/wordml/symex" xmlns:wpg="http://schemas.microsoft.com/office/word/2010/wordprocessingGroup" xmlns:wpi="http://schemas.microsoft.com/office/word/2010/wordprocessingInk" xmlns:wne="http://schemas.microsoft.com/office/word/2006/wordml" xmlns:wps="http://schemas.microsoft.com/office/word/2010/wordprocessingShape" mc:Ignorable="w14 w15 w16se w16cid w16 w16cex w16sdtdh w16sdtfl w16du wp14">
+<w:numbering xmlns:wpc="http://schemas.microsoft.com/office/word/2010/wordprocessingCanvas" xmlns:cx="http://schemas.microsoft.com/office/drawing/2014/chartex" xmlns:cx1="http://schemas.microsoft.com/office/drawing/2015/9/8/chartex" xmlns:cx2="http://schemas.microsoft.com/office/drawing/2015/10/21/chartex" xmlns:cx3="http://schemas.microsoft.com/office/drawing/2016/5/9/chartex" xmlns:cx4="http://schemas.microsoft.com/office/drawing/2016/5/10/chartex" xmlns:cx5="http://schemas.microsoft.com/office/drawing/2016/5/11/chartex" xmlns:cx6="http://schemas.microsoft.com/office/drawing/2016/5/12/chartex" xmlns:cx7="http://schemas.microsoft.com/office/drawing/2016/5/13/chartex" xmlns:cx8="http://schemas.microsoft.com/office/drawing/2016/5/14/chartex" xmlns:mc="http://schemas.openxmlformats.org/markup-compatibility/2006" xmlns:m="http://schemas.openxmlformats.org/officeDocument/2006/math" xmlns:aink="http://schemas.microsoft.com/office/drawing/2016/ink" xmlns:am3d="http://schemas.microsoft.com/office/drawing/2017/model3d" xmlns:oel="http://schemas.microsoft.com/office/2019/extlst" xmlns:r="http://schemas.openxmlformats.org/officeDocument/2006/relationships" xmlns:wp14="http://schemas.microsoft.com/office/word/2010/wordprocessingDrawing" xmlns:wp="http://schemas.openxmlformats.org/drawingml/2006/wordprocessingDrawing" xmlns:wpg="http://schemas.microsoft.com/office/word/2010/wordprocessingGroup" xmlns:wpi="http://schemas.microsoft.com/office/word/2010/wordprocessingInk" xmlns:wps="http://schemas.microsoft.com/office/word/2010/wordprocessingShape" xmlns:o="urn:schemas-microsoft-com:office:office" xmlns:v="urn:schemas-microsoft-com:vml" xmlns:w10="urn:schemas-microsoft-com:office:word" xmlns:w="http://schemas.openxmlformats.org/wordprocessingml/2006/main" xmlns:w14="http://schemas.microsoft.com/office/word/2010/wordml" xmlns:w15="http://schemas.microsoft.com/office/word/2012/wordml" xmlns:w16cex="http://schemas.microsoft.com/office/word/2018/wordml/cex" xmlns:w16cid="http://schemas.microsoft.com/office/word/2016/wordml/cid" xmlns:w16="http://schemas.microsoft.com/office/word/2018/wordml" xmlns:w16sdtdh="http://schemas.microsoft.com/office/word/2020/wordml/sdtdatahash" xmlns:w16sdtfl="http://schemas.microsoft.com/office/word/2024/wordml/sdtformatlock" xmlns:w16se="http://schemas.microsoft.com/office/word/2015/wordml/symex" xmlns:w16du="http://schemas.microsoft.com/office/word/2023/wordml/word16du" xmlns:wne="http://schemas.microsoft.com/office/word/2006/wordml" mc:Ignorable="w14 w15 w16se w16cid w16 w16cex w16sdtdh w16sdtfl w16du wp14">
   <w:abstractNum w:abstractNumId="0" w15:restartNumberingAfterBreak="0">
     <w:nsid w:val="00AB2C6D"/>
     <w:multiLevelType w:val="hybridMultilevel"/>
@@ -2238,7 +2087,7 @@
         <w:ind w:left="720" w:hanging="360"/>
       </w:pPr>
       <w:rPr>
-        <w:rFonts w:hint="default" w:ascii="Symbol" w:hAnsi="Symbol"/>
+        <w:rFonts w:ascii="Symbol" w:hAnsi="Symbol" w:hint="default"/>
       </w:rPr>
     </w:lvl>
     <w:lvl w:ilvl="1" w:tplc="D74AD436">
@@ -2250,7 +2099,7 @@
         <w:ind w:left="1440" w:hanging="360"/>
       </w:pPr>
       <w:rPr>
-        <w:rFonts w:hint="default" w:ascii="Courier New" w:hAnsi="Courier New"/>
+        <w:rFonts w:ascii="Courier New" w:hAnsi="Courier New" w:hint="default"/>
       </w:rPr>
     </w:lvl>
     <w:lvl w:ilvl="2" w:tplc="D3F03B80">
@@ -2262,7 +2111,7 @@
         <w:ind w:left="2160" w:hanging="360"/>
       </w:pPr>
       <w:rPr>
-        <w:rFonts w:hint="default" w:ascii="Wingdings" w:hAnsi="Wingdings"/>
+        <w:rFonts w:ascii="Wingdings" w:hAnsi="Wingdings" w:hint="default"/>
       </w:rPr>
     </w:lvl>
     <w:lvl w:ilvl="3" w:tplc="F25EA34E">
@@ -2274,7 +2123,7 @@
         <w:ind w:left="2880" w:hanging="360"/>
       </w:pPr>
       <w:rPr>
-        <w:rFonts w:hint="default" w:ascii="Symbol" w:hAnsi="Symbol"/>
+        <w:rFonts w:ascii="Symbol" w:hAnsi="Symbol" w:hint="default"/>
       </w:rPr>
     </w:lvl>
     <w:lvl w:ilvl="4" w:tplc="658C3DCA">
@@ -2286,7 +2135,7 @@
         <w:ind w:left="3600" w:hanging="360"/>
       </w:pPr>
       <w:rPr>
-        <w:rFonts w:hint="default" w:ascii="Courier New" w:hAnsi="Courier New"/>
+        <w:rFonts w:ascii="Courier New" w:hAnsi="Courier New" w:hint="default"/>
       </w:rPr>
     </w:lvl>
     <w:lvl w:ilvl="5" w:tplc="F9A84920">
@@ -2298,7 +2147,7 @@
         <w:ind w:left="4320" w:hanging="360"/>
       </w:pPr>
       <w:rPr>
-        <w:rFonts w:hint="default" w:ascii="Wingdings" w:hAnsi="Wingdings"/>
+        <w:rFonts w:ascii="Wingdings" w:hAnsi="Wingdings" w:hint="default"/>
       </w:rPr>
     </w:lvl>
     <w:lvl w:ilvl="6" w:tplc="AE9E8E1E">
@@ -2310,7 +2159,7 @@
         <w:ind w:left="5040" w:hanging="360"/>
       </w:pPr>
       <w:rPr>
-        <w:rFonts w:hint="default" w:ascii="Symbol" w:hAnsi="Symbol"/>
+        <w:rFonts w:ascii="Symbol" w:hAnsi="Symbol" w:hint="default"/>
       </w:rPr>
     </w:lvl>
     <w:lvl w:ilvl="7" w:tplc="9C1C85E6">
@@ -2322,7 +2171,7 @@
         <w:ind w:left="5760" w:hanging="360"/>
       </w:pPr>
       <w:rPr>
-        <w:rFonts w:hint="default" w:ascii="Courier New" w:hAnsi="Courier New"/>
+        <w:rFonts w:ascii="Courier New" w:hAnsi="Courier New" w:hint="default"/>
       </w:rPr>
     </w:lvl>
     <w:lvl w:ilvl="8" w:tplc="26D03FAA">
@@ -2334,7 +2183,7 @@
         <w:ind w:left="6480" w:hanging="360"/>
       </w:pPr>
       <w:rPr>
-        <w:rFonts w:hint="default" w:ascii="Wingdings" w:hAnsi="Wingdings"/>
+        <w:rFonts w:ascii="Wingdings" w:hAnsi="Wingdings" w:hint="default"/>
       </w:rPr>
     </w:lvl>
   </w:abstractNum>
@@ -2434,11 +2283,11 @@
 </file>
 
 <file path=word/styles.xml><?xml version="1.0" encoding="utf-8"?>
-<w:styles xmlns:mc="http://schemas.openxmlformats.org/markup-compatibility/2006" xmlns:r="http://schemas.openxmlformats.org/officeDocument/2006/relationships" xmlns:w="http://schemas.openxmlformats.org/wordprocessingml/2006/main" xmlns:w14="http://schemas.microsoft.com/office/word/2010/wordml" xmlns:w15="http://schemas.microsoft.com/office/word/2012/wordml" xmlns:w16cex="http://schemas.microsoft.com/office/word/2018/wordml/cex" xmlns:w16cid="http://schemas.microsoft.com/office/word/2016/wordml/cid" xmlns:w16="http://schemas.microsoft.com/office/word/2018/wordml" xmlns:w16du="http://schemas.microsoft.com/office/word/2023/wordml/word16du" xmlns:w16sdtdh="http://schemas.microsoft.com/office/word/2020/wordml/sdtdatahash" xmlns:w16sdtfl="http://schemas.microsoft.com/office/word/2024/wordml/sdtformatlock" xmlns:w16se="http://schemas.microsoft.com/office/word/2015/wordml/symex" mc:Ignorable="w14 w15 w16se w16cid w16 w16cex w16sdtdh w16sdtfl w16du">
+<w:styles xmlns:mc="http://schemas.openxmlformats.org/markup-compatibility/2006" xmlns:r="http://schemas.openxmlformats.org/officeDocument/2006/relationships" xmlns:w="http://schemas.openxmlformats.org/wordprocessingml/2006/main" xmlns:w14="http://schemas.microsoft.com/office/word/2010/wordml" xmlns:w15="http://schemas.microsoft.com/office/word/2012/wordml" xmlns:w16cex="http://schemas.microsoft.com/office/word/2018/wordml/cex" xmlns:w16cid="http://schemas.microsoft.com/office/word/2016/wordml/cid" xmlns:w16="http://schemas.microsoft.com/office/word/2018/wordml" xmlns:w16sdtdh="http://schemas.microsoft.com/office/word/2020/wordml/sdtdatahash" xmlns:w16sdtfl="http://schemas.microsoft.com/office/word/2024/wordml/sdtformatlock" xmlns:w16se="http://schemas.microsoft.com/office/word/2015/wordml/symex" xmlns:w16du="http://schemas.microsoft.com/office/word/2023/wordml/word16du" mc:Ignorable="w14 w15 w16se w16cid w16 w16cex w16sdtdh w16sdtfl w16du">
   <w:docDefaults>
     <w:rPrDefault>
       <w:rPr>
-        <w:rFonts w:asciiTheme="minorHAnsi" w:hAnsiTheme="minorHAnsi" w:eastAsiaTheme="minorHAnsi" w:cstheme="minorBidi"/>
+        <w:rFonts w:asciiTheme="minorHAnsi" w:eastAsiaTheme="minorHAnsi" w:hAnsiTheme="minorHAnsi" w:cstheme="minorBidi"/>
         <w:sz w:val="22"/>
         <w:szCs w:val="22"/>
         <w:lang w:val="en-US" w:eastAsia="en-US" w:bidi="ar-SA"/>
@@ -2453,14 +2302,14 @@
   <w:latentStyles w:defLockedState="0" w:defUIPriority="99" w:defSemiHidden="0" w:defUnhideWhenUsed="0" w:defQFormat="0" w:count="376">
     <w:lsdException w:name="Normal" w:uiPriority="0" w:qFormat="1"/>
     <w:lsdException w:name="heading 1" w:uiPriority="9" w:qFormat="1"/>
-    <w:lsdException w:name="heading 2" w:uiPriority="9" w:semiHidden="1" w:unhideWhenUsed="1" w:qFormat="1"/>
-    <w:lsdException w:name="heading 3" w:uiPriority="9" w:semiHidden="1" w:unhideWhenUsed="1" w:qFormat="1"/>
-    <w:lsdException w:name="heading 4" w:uiPriority="9" w:semiHidden="1" w:unhideWhenUsed="1" w:qFormat="1"/>
-    <w:lsdException w:name="heading 5" w:uiPriority="9" w:semiHidden="1" w:unhideWhenUsed="1" w:qFormat="1"/>
-    <w:lsdException w:name="heading 6" w:uiPriority="9" w:semiHidden="1" w:unhideWhenUsed="1" w:qFormat="1"/>
-    <w:lsdException w:name="heading 7" w:uiPriority="9" w:semiHidden="1" w:unhideWhenUsed="1" w:qFormat="1"/>
-    <w:lsdException w:name="heading 8" w:uiPriority="9" w:semiHidden="1" w:unhideWhenUsed="1" w:qFormat="1"/>
-    <w:lsdException w:name="heading 9" w:uiPriority="9" w:semiHidden="1" w:unhideWhenUsed="1" w:qFormat="1"/>
+    <w:lsdException w:name="heading 2" w:semiHidden="1" w:uiPriority="9" w:unhideWhenUsed="1" w:qFormat="1"/>
+    <w:lsdException w:name="heading 3" w:semiHidden="1" w:uiPriority="9" w:unhideWhenUsed="1" w:qFormat="1"/>
+    <w:lsdException w:name="heading 4" w:semiHidden="1" w:uiPriority="9" w:unhideWhenUsed="1" w:qFormat="1"/>
+    <w:lsdException w:name="heading 5" w:semiHidden="1" w:uiPriority="9" w:unhideWhenUsed="1" w:qFormat="1"/>
+    <w:lsdException w:name="heading 6" w:semiHidden="1" w:uiPriority="9" w:unhideWhenUsed="1" w:qFormat="1"/>
+    <w:lsdException w:name="heading 7" w:semiHidden="1" w:uiPriority="9" w:unhideWhenUsed="1" w:qFormat="1"/>
+    <w:lsdException w:name="heading 8" w:semiHidden="1" w:uiPriority="9" w:unhideWhenUsed="1" w:qFormat="1"/>
+    <w:lsdException w:name="heading 9" w:semiHidden="1" w:uiPriority="9" w:unhideWhenUsed="1" w:qFormat="1"/>
     <w:lsdException w:name="index 1" w:semiHidden="1" w:unhideWhenUsed="1"/>
     <w:lsdException w:name="index 2" w:semiHidden="1" w:unhideWhenUsed="1"/>
     <w:lsdException w:name="index 3" w:semiHidden="1" w:unhideWhenUsed="1"/>
@@ -2470,22 +2319,22 @@
     <w:lsdException w:name="index 7" w:semiHidden="1" w:unhideWhenUsed="1"/>
     <w:lsdException w:name="index 8" w:semiHidden="1" w:unhideWhenUsed="1"/>
     <w:lsdException w:name="index 9" w:semiHidden="1" w:unhideWhenUsed="1"/>
-    <w:lsdException w:name="toc 1" w:uiPriority="39" w:semiHidden="1" w:unhideWhenUsed="1"/>
-    <w:lsdException w:name="toc 2" w:uiPriority="39" w:semiHidden="1" w:unhideWhenUsed="1"/>
-    <w:lsdException w:name="toc 3" w:uiPriority="39" w:semiHidden="1" w:unhideWhenUsed="1"/>
-    <w:lsdException w:name="toc 4" w:uiPriority="39" w:semiHidden="1" w:unhideWhenUsed="1"/>
-    <w:lsdException w:name="toc 5" w:uiPriority="39" w:semiHidden="1" w:unhideWhenUsed="1"/>
-    <w:lsdException w:name="toc 6" w:uiPriority="39" w:semiHidden="1" w:unhideWhenUsed="1"/>
-    <w:lsdException w:name="toc 7" w:uiPriority="39" w:semiHidden="1" w:unhideWhenUsed="1"/>
-    <w:lsdException w:name="toc 8" w:uiPriority="39" w:semiHidden="1" w:unhideWhenUsed="1"/>
-    <w:lsdException w:name="toc 9" w:uiPriority="39" w:semiHidden="1" w:unhideWhenUsed="1"/>
+    <w:lsdException w:name="toc 1" w:semiHidden="1" w:uiPriority="39" w:unhideWhenUsed="1"/>
+    <w:lsdException w:name="toc 2" w:semiHidden="1" w:uiPriority="39" w:unhideWhenUsed="1"/>
+    <w:lsdException w:name="toc 3" w:semiHidden="1" w:uiPriority="39" w:unhideWhenUsed="1"/>
+    <w:lsdException w:name="toc 4" w:semiHidden="1" w:uiPriority="39" w:unhideWhenUsed="1"/>
+    <w:lsdException w:name="toc 5" w:semiHidden="1" w:uiPriority="39" w:unhideWhenUsed="1"/>
+    <w:lsdException w:name="toc 6" w:semiHidden="1" w:uiPriority="39" w:unhideWhenUsed="1"/>
+    <w:lsdException w:name="toc 7" w:semiHidden="1" w:uiPriority="39" w:unhideWhenUsed="1"/>
+    <w:lsdException w:name="toc 8" w:semiHidden="1" w:uiPriority="39" w:unhideWhenUsed="1"/>
+    <w:lsdException w:name="toc 9" w:semiHidden="1" w:uiPriority="39" w:unhideWhenUsed="1"/>
     <w:lsdException w:name="Normal Indent" w:semiHidden="1" w:unhideWhenUsed="1"/>
     <w:lsdException w:name="footnote text" w:semiHidden="1" w:unhideWhenUsed="1"/>
     <w:lsdException w:name="annotation text" w:semiHidden="1" w:unhideWhenUsed="1"/>
     <w:lsdException w:name="header" w:semiHidden="1" w:unhideWhenUsed="1"/>
     <w:lsdException w:name="footer" w:semiHidden="1" w:unhideWhenUsed="1"/>
     <w:lsdException w:name="index heading" w:semiHidden="1" w:unhideWhenUsed="1"/>
-    <w:lsdException w:name="caption" w:uiPriority="35" w:semiHidden="1" w:unhideWhenUsed="1" w:qFormat="1"/>
+    <w:lsdException w:name="caption" w:semiHidden="1" w:uiPriority="35" w:unhideWhenUsed="1" w:qFormat="1"/>
     <w:lsdException w:name="table of figures" w:semiHidden="1" w:unhideWhenUsed="1"/>
     <w:lsdException w:name="envelope address" w:semiHidden="1" w:unhideWhenUsed="1"/>
     <w:lsdException w:name="envelope return" w:semiHidden="1" w:unhideWhenUsed="1"/>
@@ -2516,7 +2365,7 @@
     <w:lsdException w:name="Title" w:uiPriority="10" w:qFormat="1"/>
     <w:lsdException w:name="Closing" w:semiHidden="1" w:unhideWhenUsed="1"/>
     <w:lsdException w:name="Signature" w:semiHidden="1" w:unhideWhenUsed="1"/>
-    <w:lsdException w:name="Default Paragraph Font" w:uiPriority="1" w:semiHidden="1" w:unhideWhenUsed="1"/>
+    <w:lsdException w:name="Default Paragraph Font" w:semiHidden="1" w:uiPriority="1" w:unhideWhenUsed="1"/>
     <w:lsdException w:name="Body Text" w:semiHidden="1" w:unhideWhenUsed="1"/>
     <w:lsdException w:name="Body Text Indent" w:semiHidden="1" w:unhideWhenUsed="1"/>
     <w:lsdException w:name="List Continue" w:semiHidden="1" w:unhideWhenUsed="1"/>
@@ -2716,8 +2565,8 @@
     <w:lsdException w:name="Subtle Reference" w:uiPriority="31" w:qFormat="1"/>
     <w:lsdException w:name="Intense Reference" w:uiPriority="32" w:qFormat="1"/>
     <w:lsdException w:name="Book Title" w:uiPriority="33" w:qFormat="1"/>
-    <w:lsdException w:name="Bibliography" w:uiPriority="37" w:semiHidden="1" w:unhideWhenUsed="1"/>
-    <w:lsdException w:name="TOC Heading" w:uiPriority="39" w:semiHidden="1" w:unhideWhenUsed="1" w:qFormat="1"/>
+    <w:lsdException w:name="Bibliography" w:semiHidden="1" w:uiPriority="37" w:unhideWhenUsed="1"/>
+    <w:lsdException w:name="TOC Heading" w:semiHidden="1" w:uiPriority="39" w:unhideWhenUsed="1" w:qFormat="1"/>
     <w:lsdException w:name="Plain Table 1" w:uiPriority="41"/>
     <w:lsdException w:name="Plain Table 2" w:uiPriority="42"/>
     <w:lsdException w:name="Plain Table 3" w:uiPriority="43"/>
@@ -2828,17 +2677,17 @@
     <w:lsdException w:name="Unresolved Mention" w:semiHidden="1" w:unhideWhenUsed="1"/>
     <w:lsdException w:name="Smart Link" w:semiHidden="1" w:unhideWhenUsed="1"/>
   </w:latentStyles>
-  <w:style w:type="paragraph" w:styleId="Normal" w:default="1">
+  <w:style w:type="paragraph" w:default="1" w:styleId="Normal">
     <w:name w:val="Normal"/>
     <w:qFormat/>
   </w:style>
-  <w:style w:type="character" w:styleId="DefaultParagraphFont" w:default="1">
+  <w:style w:type="character" w:default="1" w:styleId="DefaultParagraphFont">
     <w:name w:val="Default Paragraph Font"/>
     <w:uiPriority w:val="1"/>
     <w:semiHidden/>
     <w:unhideWhenUsed/>
   </w:style>
-  <w:style w:type="table" w:styleId="TableNormal" w:default="1">
+  <w:style w:type="table" w:default="1" w:styleId="TableNormal">
     <w:name w:val="Normal Table"/>
     <w:uiPriority w:val="99"/>
     <w:semiHidden/>
@@ -2853,19 +2702,19 @@
       </w:tblCellMar>
     </w:tblPr>
   </w:style>
-  <w:style w:type="numbering" w:styleId="NoList" w:default="1">
+  <w:style w:type="numbering" w:default="1" w:styleId="NoList">
     <w:name w:val="No List"/>
     <w:uiPriority w:val="99"/>
     <w:semiHidden/>
     <w:unhideWhenUsed/>
   </w:style>
-  <w:style w:type="character" w:styleId="normaltextrun" w:customStyle="1">
+  <w:style w:type="character" w:customStyle="1" w:styleId="normaltextrun">
     <w:name w:val="normaltextrun"/>
     <w:basedOn w:val="DefaultParagraphFont"/>
     <w:uiPriority w:val="1"/>
     <w:rsid w:val="08AD0FDA"/>
   </w:style>
-  <w:style w:type="character" w:styleId="eop" w:customStyle="1">
+  <w:style w:type="character" w:customStyle="1" w:styleId="eop">
     <w:name w:val="eop"/>
     <w:basedOn w:val="DefaultParagraphFont"/>
     <w:uiPriority w:val="1"/>
@@ -2891,12 +2740,12 @@
     </w:pPr>
     <w:tblPr>
       <w:tblBorders>
-        <w:top w:val="single" w:color="000000" w:themeColor="text1" w:sz="4" w:space="0"/>
-        <w:left w:val="single" w:color="000000" w:themeColor="text1" w:sz="4" w:space="0"/>
-        <w:bottom w:val="single" w:color="000000" w:themeColor="text1" w:sz="4" w:space="0"/>
-        <w:right w:val="single" w:color="000000" w:themeColor="text1" w:sz="4" w:space="0"/>
-        <w:insideH w:val="single" w:color="000000" w:themeColor="text1" w:sz="4" w:space="0"/>
-        <w:insideV w:val="single" w:color="000000" w:themeColor="text1" w:sz="4" w:space="0"/>
+        <w:top w:val="single" w:sz="4" w:space="0" w:color="000000" w:themeColor="text1"/>
+        <w:left w:val="single" w:sz="4" w:space="0" w:color="000000" w:themeColor="text1"/>
+        <w:bottom w:val="single" w:sz="4" w:space="0" w:color="000000" w:themeColor="text1"/>
+        <w:right w:val="single" w:sz="4" w:space="0" w:color="000000" w:themeColor="text1"/>
+        <w:insideH w:val="single" w:sz="4" w:space="0" w:color="000000" w:themeColor="text1"/>
+        <w:insideV w:val="single" w:sz="4" w:space="0" w:color="000000" w:themeColor="text1"/>
       </w:tblBorders>
     </w:tblPr>
   </w:style>
@@ -2923,7 +2772,7 @@
       <w:spacing w:before="100" w:beforeAutospacing="1" w:after="100" w:afterAutospacing="1" w:line="240" w:lineRule="auto"/>
     </w:pPr>
     <w:rPr>
-      <w:rFonts w:ascii="Times New Roman" w:hAnsi="Times New Roman" w:eastAsia="Times New Roman" w:cs="Times New Roman"/>
+      <w:rFonts w:ascii="Times New Roman" w:eastAsia="Times New Roman" w:hAnsi="Times New Roman" w:cs="Times New Roman"/>
       <w:sz w:val="24"/>
       <w:szCs w:val="24"/>
     </w:rPr>
@@ -2965,7 +2814,7 @@
       <w:szCs w:val="20"/>
     </w:rPr>
   </w:style>
-  <w:style w:type="character" w:styleId="CommentTextChar" w:customStyle="1">
+  <w:style w:type="character" w:customStyle="1" w:styleId="CommentTextChar">
     <w:name w:val="Comment Text Char"/>
     <w:basedOn w:val="DefaultParagraphFont"/>
     <w:link w:val="CommentText"/>
@@ -3013,7 +2862,7 @@
       <w:spacing w:after="0" w:line="240" w:lineRule="auto"/>
     </w:pPr>
   </w:style>
-  <w:style w:type="character" w:styleId="HeaderChar" w:customStyle="1">
+  <w:style w:type="character" w:customStyle="1" w:styleId="HeaderChar">
     <w:name w:val="Header Char"/>
     <w:basedOn w:val="DefaultParagraphFont"/>
     <w:link w:val="Header"/>
@@ -3035,7 +2884,7 @@
       <w:spacing w:after="0" w:line="240" w:lineRule="auto"/>
     </w:pPr>
   </w:style>
-  <w:style w:type="character" w:styleId="FooterChar" w:customStyle="1">
+  <w:style w:type="character" w:customStyle="1" w:styleId="FooterChar">
     <w:name w:val="Footer Char"/>
     <w:basedOn w:val="DefaultParagraphFont"/>
     <w:link w:val="Footer"/>
@@ -3046,7 +2895,7 @@
 </file>
 
 <file path=word/theme/theme1.xml><?xml version="1.0" encoding="utf-8"?>
-<a:theme xmlns:a="http://schemas.openxmlformats.org/drawingml/2006/main" xmlns:thm15="http://schemas.microsoft.com/office/thememl/2012/main" name="Office Theme">
+<a:theme xmlns:a="http://schemas.openxmlformats.org/drawingml/2006/main" name="Office Theme">
   <a:themeElements>
     <a:clrScheme name="Office">
       <a:dk1>
@@ -3307,12 +3156,14 @@
 </file>
 
 <file path=customXml/item1.xml><?xml version="1.0" encoding="utf-8"?>
-<?mso-contentType ?>
-<FormTemplates xmlns="http://schemas.microsoft.com/sharepoint/v3/contenttype/forms">
-  <Display>DocumentLibraryForm</Display>
-  <Edit>DocumentLibraryForm</Edit>
-  <New>DocumentLibraryForm</New>
-</FormTemplates>
+<p:properties xmlns:p="http://schemas.microsoft.com/office/2006/metadata/properties" xmlns:xsi="http://www.w3.org/2001/XMLSchema-instance" xmlns:pc="http://schemas.microsoft.com/office/infopath/2007/PartnerControls">
+  <documentManagement>
+    <TaxCatchAll xmlns="530517bb-b50c-4599-82d9-b1a16adffa97" xsi:nil="true"/>
+    <lcf76f155ced4ddcb4097134ff3c332f xmlns="8cb223eb-8fc9-43bb-896c-9785dfdd840e">
+      <Terms xmlns="http://schemas.microsoft.com/office/infopath/2007/PartnerControls"/>
+    </lcf76f155ced4ddcb4097134ff3c332f>
+  </documentManagement>
+</p:properties>
 </file>
 
 <file path=customXml/item2.xml><?xml version="1.0" encoding="utf-8"?>
@@ -3511,20 +3362,21 @@
 </file>
 
 <file path=customXml/item3.xml><?xml version="1.0" encoding="utf-8"?>
-<p:properties xmlns:p="http://schemas.microsoft.com/office/2006/metadata/properties" xmlns:xsi="http://www.w3.org/2001/XMLSchema-instance" xmlns:pc="http://schemas.microsoft.com/office/infopath/2007/PartnerControls">
-  <documentManagement>
-    <TaxCatchAll xmlns="530517bb-b50c-4599-82d9-b1a16adffa97" xsi:nil="true"/>
-    <lcf76f155ced4ddcb4097134ff3c332f xmlns="8cb223eb-8fc9-43bb-896c-9785dfdd840e">
-      <Terms xmlns="http://schemas.microsoft.com/office/infopath/2007/PartnerControls"/>
-    </lcf76f155ced4ddcb4097134ff3c332f>
-  </documentManagement>
-</p:properties>
+<?mso-contentType ?>
+<FormTemplates xmlns="http://schemas.microsoft.com/sharepoint/v3/contenttype/forms">
+  <Display>DocumentLibraryForm</Display>
+  <Edit>DocumentLibraryForm</Edit>
+  <New>DocumentLibraryForm</New>
+</FormTemplates>
 </file>
 
 <file path=customXml/itemProps1.xml><?xml version="1.0" encoding="utf-8"?>
-<ds:datastoreItem xmlns:ds="http://schemas.openxmlformats.org/officeDocument/2006/customXml" ds:itemID="{2F741E2D-3E13-4587-BD8E-DD6D97817274}">
+<ds:datastoreItem xmlns:ds="http://schemas.openxmlformats.org/officeDocument/2006/customXml" ds:itemID="{5A4F61C4-A38D-470F-AC7E-34725D3C0524}">
   <ds:schemaRefs>
-    <ds:schemaRef ds:uri="http://schemas.microsoft.com/sharepoint/v3/contenttype/forms"/>
+    <ds:schemaRef ds:uri="http://schemas.microsoft.com/office/2006/metadata/properties"/>
+    <ds:schemaRef ds:uri="http://schemas.microsoft.com/office/infopath/2007/PartnerControls"/>
+    <ds:schemaRef ds:uri="530517bb-b50c-4599-82d9-b1a16adffa97"/>
+    <ds:schemaRef ds:uri="8cb223eb-8fc9-43bb-896c-9785dfdd840e"/>
   </ds:schemaRefs>
 </ds:datastoreItem>
 </file>
@@ -3549,12 +3401,9 @@
 </file>
 
 <file path=customXml/itemProps3.xml><?xml version="1.0" encoding="utf-8"?>
-<ds:datastoreItem xmlns:ds="http://schemas.openxmlformats.org/officeDocument/2006/customXml" ds:itemID="{5A4F61C4-A38D-470F-AC7E-34725D3C0524}">
+<ds:datastoreItem xmlns:ds="http://schemas.openxmlformats.org/officeDocument/2006/customXml" ds:itemID="{2F741E2D-3E13-4587-BD8E-DD6D97817274}">
   <ds:schemaRefs>
-    <ds:schemaRef ds:uri="http://schemas.microsoft.com/office/2006/metadata/properties"/>
-    <ds:schemaRef ds:uri="http://schemas.microsoft.com/office/infopath/2007/PartnerControls"/>
-    <ds:schemaRef ds:uri="530517bb-b50c-4599-82d9-b1a16adffa97"/>
-    <ds:schemaRef ds:uri="8cb223eb-8fc9-43bb-896c-9785dfdd840e"/>
+    <ds:schemaRef ds:uri="http://schemas.microsoft.com/sharepoint/v3/contenttype/forms"/>
   </ds:schemaRefs>
 </ds:datastoreItem>
 </file>
</xml_diff>